<commit_message>
vault backup: 2025-09-26 18:41:56
</commit_message>
<xml_diff>
--- a/学校/刘非凡选题报告 .docx
+++ b/学校/刘非凡选题报告 .docx
@@ -116,7 +116,7 @@
           </mc:Choice>
           <mc:Fallback>
             <w:pict>
-              <v:group w14:anchorId="77F1340F" id="Group 24" o:spid="_x0000_s1026" style="position:absolute;margin-left:63pt;margin-top:11.7pt;width:324pt;height:124.8pt;z-index:251659264" coordsize="6480,2964" o:gfxdata="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">
+              <v:group w14:anchorId="6C341F47" id="Group 24" o:spid="_x0000_s1026" style="position:absolute;margin-left:63pt;margin-top:11.7pt;width:324pt;height:124.8pt;z-index:251659264" coordsize="6480,2964" o:gfxdata="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">
                 <o:lock v:ext="edit" aspectratio="t"/>
                 <v:shapetype id="_x0000_t75" coordsize="21600,21600" o:spt="75" o:preferrelative="t" path="m@4@5l@4@11@9@11@9@5xe" filled="f" stroked="f">
                   <v:stroke joinstyle="miter"/>
@@ -1438,7 +1438,6 @@
                 <w:sz w:val="28"/>
                 <w:szCs w:val="28"/>
               </w:rPr>
-              <w:lastRenderedPageBreak/>
               <w:t>论文</w:t>
             </w:r>
             <w:r>
@@ -1565,27 +1564,18 @@
               <w:spacing w:beforeLines="50" w:before="156" w:afterLines="50" w:after="156"/>
               <w:ind w:firstLineChars="200" w:firstLine="480"/>
               <w:rPr>
-                <w:rFonts w:ascii="宋体" w:hAnsi="宋体" w:cs="宋体" w:hint="eastAsia"/>
-                <w:kern w:val="0"/>
-                <w:sz w:val="24"/>
-              </w:rPr>
-            </w:pPr>
-            <w:r>
-              <w:rPr>
                 <w:rFonts w:ascii="宋体" w:hAnsi="宋体" w:cs="宋体"/>
                 <w:kern w:val="0"/>
                 <w:sz w:val="24"/>
               </w:rPr>
-              <w:t>因此，将不断迭代演进的YOLO系列算法应用于道路病害检测，不仅仅是对传统巡检方式的技术替代，更是一场深刻的行业变革。它能够将道路巡检的自动化与智能化水平提升至新的高度，实现对路网健康状况的近乎实时的监控与评估。由此产生的高精度、</w:t>
-            </w:r>
+            </w:pPr>
             <w:r>
               <w:rPr>
                 <w:rFonts w:ascii="宋体" w:hAnsi="宋体" w:cs="宋体"/>
                 <w:kern w:val="0"/>
                 <w:sz w:val="24"/>
               </w:rPr>
-              <w:lastRenderedPageBreak/>
-              <w:t>时空关联的道路病害数据，将成为智慧交通管理系统的关键信息输入，能够为城市基础设施的预防性维护提供前所未有的决策依据，帮助管理者从“被动响应”转向“主动预测”。此外，这些数据对于保障自动驾驶技术的安全性与可靠性也至关重要，能够为高精地图的动态更新和车辆的路径规划提供安全冗余。综上所述，该研究不仅是技术层面的创新，更是推动交通基础设施管养模式向数字化、智能化、精细化方向现代转型的核心驱动力之一。</w:t>
+              <w:t>因此，将不断迭代演进的YOLO系列算法应用于道路病害检测，不仅仅是对传统巡检方式的技术替代，更是一场深刻的行业变革。它能够将道路巡检的自动化与智能化水平提升至新的高度，实现对路网健康状况的近乎实时的监控与评估。由此产生的高精度、时空关联的道路病害数据，将成为智慧交通管理系统的关键信息输入，能够为城市基础设施的预防性维护提供前所未有的决策依据，帮助管理者从“被动响应”转向“主动预测”。此外，这些数据对于保障自动驾驶技术的安全性与可靠性也至关重要，能够为高精地图的动态更新和车辆的路径规划提供安全冗余。综上所述，该研究不仅是技术层面的创新，更是推动交通基础设施管养模式向数字化、智能化、精细化方向现代转型的核心驱动力之一。</w:t>
             </w:r>
           </w:p>
           <w:p>
@@ -1751,7 +1741,6 @@
               <w:rPr>
                 <w:rFonts w:ascii="黑体" w:eastAsia="黑体" w:hAnsi="黑体" w:cs="黑体" w:hint="eastAsia"/>
               </w:rPr>
-              <w:lastRenderedPageBreak/>
               <w:t>参考文献</w:t>
             </w:r>
           </w:p>
@@ -1895,7 +1884,6 @@
                 <w:sz w:val="28"/>
                 <w:szCs w:val="28"/>
               </w:rPr>
-              <w:lastRenderedPageBreak/>
               <w:t>主要的研究</w:t>
             </w:r>
             <w:r>
@@ -1943,7 +1931,7 @@
               <w:spacing w:beforeLines="50" w:before="156" w:afterLines="50" w:after="156"/>
               <w:ind w:firstLineChars="200" w:firstLine="480"/>
               <w:rPr>
-                <w:rFonts w:ascii="宋体" w:hAnsi="宋体" w:cs="宋体" w:hint="eastAsia"/>
+                <w:rFonts w:ascii="宋体" w:hAnsi="宋体" w:cs="宋体"/>
                 <w:kern w:val="0"/>
                 <w:sz w:val="24"/>
               </w:rPr>
@@ -2047,60 +2035,36 @@
               <w:spacing w:beforeLines="50" w:before="156" w:afterLines="50" w:after="156"/>
               <w:ind w:firstLineChars="200" w:firstLine="480"/>
               <w:rPr>
-                <w:rFonts w:ascii="宋体" w:hAnsi="宋体" w:cs="宋体" w:hint="eastAsia"/>
-                <w:kern w:val="0"/>
-                <w:sz w:val="24"/>
-              </w:rPr>
-            </w:pPr>
-            <w:r>
-              <w:rPr>
                 <w:rFonts w:ascii="宋体" w:hAnsi="宋体" w:cs="宋体"/>
                 <w:kern w:val="0"/>
                 <w:sz w:val="24"/>
               </w:rPr>
-              <w:t>本研究将采用国际权威的RDD2022（Road Damage Detection 2022）数据集作为实验数据。该数据集包含了来自全球多个国家的超过4万张道路图像，涵盖了多种类型和不同严重程度的病害，场景多样，极具挑战性。在模型训练阶段，将采用迁移学习策略，加载YOLOv12的预训练权重进行初始化，并结合Mosaic、</w:t>
-            </w:r>
-            <w:proofErr w:type="spellStart"/>
+            </w:pPr>
             <w:r>
               <w:rPr>
                 <w:rFonts w:ascii="宋体" w:hAnsi="宋体" w:cs="宋体"/>
                 <w:kern w:val="0"/>
                 <w:sz w:val="24"/>
               </w:rPr>
-              <w:t>MixUp</w:t>
-            </w:r>
-            <w:proofErr w:type="spellEnd"/>
+              <w:t>本研究将采用国际权威的RDD2022（Road Damage Detection 2022）数据集作为实验数据。该数据集包含了来自全球多个国家的超过4万张道路图像，涵盖了多种类型和不同严重程度的病害，场景多样，极具挑战性。在模型训练阶段，将采用迁移学习策略，加载YOLOv12的预训练权重进行初始化，并结合Mosaic、</w:t>
+            </w:r>
+            <w:proofErr w:type="spellStart"/>
             <w:r>
               <w:rPr>
                 <w:rFonts w:ascii="宋体" w:hAnsi="宋体" w:cs="宋体"/>
                 <w:kern w:val="0"/>
                 <w:sz w:val="24"/>
               </w:rPr>
-              <w:t>等先进的数据增强技术来提升模型的泛化能力。</w:t>
-            </w:r>
+              <w:t>MixUp</w:t>
+            </w:r>
+            <w:proofErr w:type="spellEnd"/>
             <w:r>
               <w:rPr>
                 <w:rFonts w:ascii="宋体" w:hAnsi="宋体" w:cs="宋体"/>
                 <w:kern w:val="0"/>
                 <w:sz w:val="24"/>
               </w:rPr>
-              <w:fldChar w:fldCharType="begin"/>
-            </w:r>
-            <w:r>
-              <w:rPr>
-                <w:rFonts w:ascii="宋体" w:hAnsi="宋体" w:cs="宋体"/>
-                <w:kern w:val="0"/>
-                <w:sz w:val="24"/>
-              </w:rPr>
-              <w:instrText xml:space="preserve"> LISTNUM </w:instrText>
-            </w:r>
-            <w:r>
-              <w:rPr>
-                <w:rFonts w:ascii="宋体" w:hAnsi="宋体" w:cs="宋体"/>
-                <w:kern w:val="0"/>
-                <w:sz w:val="24"/>
-              </w:rPr>
-              <w:fldChar w:fldCharType="end"/>
+              <w:t>等先进的数据增强技术来提升模型的泛化能力。</w:t>
             </w:r>
           </w:p>
           <w:p>
@@ -2225,9 +2189,6 @@
               <w:widowControl/>
               <w:spacing w:beforeLines="50" w:before="156" w:afterLines="50" w:after="156"/>
               <w:ind w:firstLineChars="200" w:firstLine="480"/>
-              <w:rPr>
-                <w:rFonts w:hint="eastAsia"/>
-              </w:rPr>
             </w:pPr>
             <w:r>
               <w:rPr>
@@ -2235,7 +2196,6 @@
                 <w:kern w:val="0"/>
                 <w:sz w:val="24"/>
               </w:rPr>
-              <w:lastRenderedPageBreak/>
               <w:t>通过全面的实验，将所提出的改进模型与原始YOLOv12模型以及其他主流检测模型（如YOLOv8、YOLOv7等）进行性能对比。同时，设计严谨的消融实验，逐一验证轻量化模块和注意力机制的有效性，最终得到一个在精度、速度和模型大小方面均表现优异的道路病害检测模型。通过全面的实验，将所提出的改进模型与原始YOLOv12模型以及其他主流检测模型（如YOLOv8、YOLOv7等）进行性能对比。同时，设计严谨的消融实验，逐一验证轻量化模块和注意力机制的有效性，最终得到一个在精度、速度和模型大小方面均表现优异的道路病害检测模型。</w:t>
             </w:r>
           </w:p>
@@ -2274,7 +2234,6 @@
                 <w:sz w:val="28"/>
                 <w:szCs w:val="28"/>
               </w:rPr>
-              <w:lastRenderedPageBreak/>
               <w:t>本</w:t>
             </w:r>
             <w:r>
@@ -2343,7 +2302,7 @@
               <w:spacing w:beforeLines="50" w:before="156" w:afterLines="50" w:after="156"/>
               <w:ind w:leftChars="150" w:left="797" w:hangingChars="200" w:hanging="482"/>
               <w:rPr>
-                <w:rFonts w:asciiTheme="minorEastAsia" w:eastAsiaTheme="minorEastAsia" w:hAnsiTheme="minorEastAsia" w:hint="eastAsia"/>
+                <w:rFonts w:asciiTheme="minorEastAsia" w:eastAsiaTheme="minorEastAsia" w:hAnsiTheme="minorEastAsia"/>
               </w:rPr>
             </w:pPr>
             <w:r>
@@ -2591,7 +2550,6 @@
                 <w:sz w:val="28"/>
                 <w:szCs w:val="28"/>
               </w:rPr>
-              <w:lastRenderedPageBreak/>
               <w:t>拟采取的研究方法、措施和进度安排</w:t>
             </w:r>
           </w:p>
@@ -2989,7 +2947,6 @@
                 <w:sz w:val="28"/>
                 <w:szCs w:val="28"/>
               </w:rPr>
-              <w:lastRenderedPageBreak/>
               <w:t>已有的</w:t>
             </w:r>
             <w:r>
@@ -3284,7 +3241,6 @@
                 <w:sz w:val="28"/>
                 <w:szCs w:val="28"/>
               </w:rPr>
-              <w:lastRenderedPageBreak/>
               <w:t>六、经费预算</w:t>
             </w:r>
             <w:r>
@@ -3647,7 +3603,6 @@
                 <w:b/>
                 <w:sz w:val="24"/>
               </w:rPr>
-              <w:lastRenderedPageBreak/>
               <w:t>七、导师审查意见</w:t>
             </w:r>
             <w:r>
@@ -3950,7 +3905,6 @@
                 <w:b/>
                 <w:sz w:val="24"/>
               </w:rPr>
-              <w:lastRenderedPageBreak/>
               <w:t>八、选题报告会记录</w:t>
             </w:r>
             <w:r>
@@ -5049,7 +5003,6 @@
                 <w:color w:val="000000"/>
                 <w:sz w:val="24"/>
               </w:rPr>
-              <w:lastRenderedPageBreak/>
               <w:t>选题</w:t>
             </w:r>
             <w:r>
@@ -5549,7 +5502,6 @@
           <w:b/>
           <w:sz w:val="28"/>
         </w:rPr>
-        <w:lastRenderedPageBreak/>
         <w:t>十一</w:t>
       </w:r>
       <w:r>
@@ -11605,6 +11557,7 @@
   <w:style w:type="character" w:default="1" w:styleId="a0">
     <w:name w:val="Default Paragraph Font"/>
     <w:uiPriority w:val="1"/>
+    <w:semiHidden/>
     <w:unhideWhenUsed/>
   </w:style>
   <w:style w:type="table" w:default="1" w:styleId="a1">

</xml_diff>

<commit_message>
vault backup: 2025-09-26 18:50:10
</commit_message>
<xml_diff>
--- a/学校/刘非凡选题报告 .docx
+++ b/学校/刘非凡选题报告 .docx
@@ -116,7 +116,7 @@
           </mc:Choice>
           <mc:Fallback>
             <w:pict>
-              <v:group w14:anchorId="6C341F47" id="Group 24" o:spid="_x0000_s1026" style="position:absolute;margin-left:63pt;margin-top:11.7pt;width:324pt;height:124.8pt;z-index:251659264" coordsize="6480,2964" o:gfxdata="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">
+              <v:group w14:anchorId="30F5C62C" id="Group 24" o:spid="_x0000_s1026" style="position:absolute;margin-left:63pt;margin-top:11.7pt;width:324pt;height:124.8pt;z-index:251659264" coordsize="6480,2964" o:gfxdata="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">
                 <o:lock v:ext="edit" aspectratio="t"/>
                 <v:shapetype id="_x0000_t75" coordsize="21600,21600" o:spt="75" o:preferrelative="t" path="m@4@5l@4@11@9@11@9@5xe" filled="f" stroked="f">
                   <v:stroke joinstyle="miter"/>
@@ -1651,61 +1651,7 @@
                 <w:kern w:val="0"/>
                 <w:sz w:val="24"/>
               </w:rPr>
-              <w:t>为了应对这一挑战，学术界和工业界正从两个主要方向进行探索。其一是模型轻量化设计，旨在降低模型的参数量和计算复杂度（FLOPs）。以</w:t>
-            </w:r>
-            <w:proofErr w:type="spellStart"/>
-            <w:r>
-              <w:rPr>
-                <w:rFonts w:ascii="宋体" w:hAnsi="宋体" w:cs="宋体"/>
-                <w:kern w:val="0"/>
-                <w:sz w:val="24"/>
-              </w:rPr>
-              <w:t>MobileNet</w:t>
-            </w:r>
-            <w:proofErr w:type="spellEnd"/>
-            <w:r>
-              <w:rPr>
-                <w:rFonts w:ascii="宋体" w:hAnsi="宋体" w:cs="宋体"/>
-                <w:kern w:val="0"/>
-                <w:sz w:val="24"/>
-              </w:rPr>
-              <w:t>系列、</w:t>
-            </w:r>
-            <w:proofErr w:type="spellStart"/>
-            <w:r>
-              <w:rPr>
-                <w:rFonts w:ascii="宋体" w:hAnsi="宋体" w:cs="宋体"/>
-                <w:kern w:val="0"/>
-                <w:sz w:val="24"/>
-              </w:rPr>
-              <w:t>ShuffleNet</w:t>
-            </w:r>
-            <w:proofErr w:type="spellEnd"/>
-            <w:r>
-              <w:rPr>
-                <w:rFonts w:ascii="宋体" w:hAnsi="宋体" w:cs="宋体"/>
-                <w:kern w:val="0"/>
-                <w:sz w:val="24"/>
-              </w:rPr>
-              <w:t>和</w:t>
-            </w:r>
-            <w:proofErr w:type="spellStart"/>
-            <w:r>
-              <w:rPr>
-                <w:rFonts w:ascii="宋体" w:hAnsi="宋体" w:cs="宋体"/>
-                <w:kern w:val="0"/>
-                <w:sz w:val="24"/>
-              </w:rPr>
-              <w:t>GhostNet</w:t>
-            </w:r>
-            <w:proofErr w:type="spellEnd"/>
-            <w:r>
-              <w:rPr>
-                <w:rFonts w:ascii="宋体" w:hAnsi="宋体" w:cs="宋体"/>
-                <w:kern w:val="0"/>
-                <w:sz w:val="24"/>
-              </w:rPr>
-              <w:t>为代表的轻量级网络架构，通过引入深度可分离卷积、通道混洗、幽灵模块（Ghost Module）等创新设计，在保证模型性能的同时，极大地压缩了模型体积，为深度学习模型在移动端和嵌入式设备上的应用铺平了道路。其二是通过注意力机制（Attention Mechanism）强化模型的特征表达能力。该机制模仿人类视觉系统，使模型能够自适应地聚焦于图像中的关键信息。从开创性的SE-Net，到融合了通道与空间注意力的CBAM，再到近期提出的无需额外参数的SimAM，注意力机制已被证明能够有效提升模型对小目标、遮挡目标的识别能力。</w:t>
+              <w:t>为了应对这一挑战，学术界和工业界正从两个主要方向进行探索。其一是模型轻量化设计，旨在降低模型的参数量和计算复杂度（FLOPs）。以MobileNet系列、ShuffleNet和GhostNet为代表的轻量级网络架构，通过引入深度可分离卷积、通道混洗、幽灵模块（Ghost Module）等创新设计，在保证模型性能的同时，极大地压缩了模型体积，为深度学习模型在移动端和嵌入式设备上的应用铺平了道路。其二是通过注意力机制（Attention Mechanism）强化模型的特征表达能力。该机制模仿人类视觉系统，使模型能够自适应地聚焦于图像中的关键信息。从开创性的SE-Net，到融合了通道与空间注意力的CBAM，再到近期提出的无需额外参数的SimAM，注意力机制已被证明能够有效提升模型对小目标、遮挡目标的识别能力。</w:t>
             </w:r>
           </w:p>
           <w:p>
@@ -1730,122 +1676,7 @@
           </w:p>
           <w:p>
             <w:pPr>
-              <w:pStyle w:val="af5"/>
-              <w:numPr>
-                <w:ilvl w:val="1"/>
-                <w:numId w:val="17"/>
-              </w:numPr>
-              <w:ind w:right="-295" w:firstLineChars="0"/>
-            </w:pPr>
-            <w:r>
-              <w:rPr>
-                <w:rFonts w:ascii="黑体" w:eastAsia="黑体" w:hAnsi="黑体" w:cs="黑体" w:hint="eastAsia"/>
-              </w:rPr>
-              <w:t>参考文献</w:t>
-            </w:r>
-          </w:p>
-          <w:p>
-            <w:pPr>
               <w:spacing w:line="300" w:lineRule="exact"/>
-              <w:ind w:left="286" w:hangingChars="119" w:hanging="286"/>
-              <w:rPr>
-                <w:sz w:val="24"/>
-              </w:rPr>
-            </w:pPr>
-            <w:bookmarkStart w:id="0" w:name="参考文献1"/>
-            <w:r>
-              <w:rPr>
-                <w:sz w:val="24"/>
-              </w:rPr>
-              <w:t xml:space="preserve">[1] A. </w:t>
-            </w:r>
-            <w:proofErr w:type="spellStart"/>
-            <w:r>
-              <w:rPr>
-                <w:sz w:val="24"/>
-              </w:rPr>
-              <w:t>Papadoulis</w:t>
-            </w:r>
-            <w:proofErr w:type="spellEnd"/>
-            <w:r>
-              <w:rPr>
-                <w:sz w:val="24"/>
-              </w:rPr>
-              <w:t xml:space="preserve">, M. Quddus, M. </w:t>
-            </w:r>
-            <w:proofErr w:type="spellStart"/>
-            <w:r>
-              <w:rPr>
-                <w:sz w:val="24"/>
-              </w:rPr>
-              <w:t>Imprialou</w:t>
-            </w:r>
-            <w:proofErr w:type="spellEnd"/>
-            <w:r>
-              <w:rPr>
-                <w:sz w:val="24"/>
-              </w:rPr>
-              <w:t>, Evaluating the safety impact of</w:t>
-            </w:r>
-            <w:r>
-              <w:rPr>
-                <w:rFonts w:hint="eastAsia"/>
-                <w:sz w:val="24"/>
-              </w:rPr>
-              <w:t xml:space="preserve"> </w:t>
-            </w:r>
-            <w:r>
-              <w:rPr>
-                <w:sz w:val="24"/>
-              </w:rPr>
-              <w:t>connected and</w:t>
-            </w:r>
-            <w:r>
-              <w:rPr>
-                <w:rFonts w:hint="eastAsia"/>
-                <w:sz w:val="24"/>
-              </w:rPr>
-              <w:t xml:space="preserve"> </w:t>
-            </w:r>
-            <w:r>
-              <w:rPr>
-                <w:sz w:val="24"/>
-              </w:rPr>
-              <w:t xml:space="preserve">autonomous vehicles on motorways, </w:t>
-            </w:r>
-            <w:proofErr w:type="spellStart"/>
-            <w:r>
-              <w:rPr>
-                <w:sz w:val="24"/>
-              </w:rPr>
-              <w:t>Accid</w:t>
-            </w:r>
-            <w:proofErr w:type="spellEnd"/>
-            <w:r>
-              <w:rPr>
-                <w:sz w:val="24"/>
-              </w:rPr>
-              <w:t>. Anal. Prev. 124</w:t>
-            </w:r>
-            <w:r>
-              <w:rPr>
-                <w:rFonts w:hint="eastAsia"/>
-                <w:sz w:val="24"/>
-              </w:rPr>
-              <w:t xml:space="preserve"> </w:t>
-            </w:r>
-            <w:r>
-              <w:rPr>
-                <w:sz w:val="24"/>
-              </w:rPr>
-              <w:t>(2019) 12–22.</w:t>
-            </w:r>
-            <w:bookmarkEnd w:id="0"/>
-          </w:p>
-          <w:p>
-            <w:pPr>
-              <w:spacing w:line="300" w:lineRule="exact"/>
-              <w:ind w:left="286" w:hangingChars="119" w:hanging="286"/>
               <w:rPr>
                 <w:sz w:val="24"/>
               </w:rPr>
@@ -1864,12 +1695,13 @@
           </w:tcPr>
           <w:p>
             <w:pPr>
+              <w:pStyle w:val="a5"/>
               <w:numPr>
                 <w:ilvl w:val="0"/>
-                <w:numId w:val="18"/>
+                <w:numId w:val="1"/>
               </w:numPr>
               <w:spacing w:afterLines="50" w:after="156"/>
-              <w:ind w:right="-295"/>
+              <w:outlineLvl w:val="0"/>
               <w:rPr>
                 <w:rFonts w:ascii="黑体" w:eastAsia="黑体" w:hAnsi="黑体"/>
                 <w:b/>
@@ -1942,25 +1774,7 @@
                 <w:kern w:val="0"/>
                 <w:sz w:val="24"/>
               </w:rPr>
-              <w:t>本研究的核心思路是以最新的YOLOv12模型为基础，针对道路病害检测任务在边缘设备上部署时对实时性和高精度的双重需求，从模型轻量化和特征增强两个维度进行深度改进。首先，对YOLOv12的网络结构进行详细解析，识别其关键计算瓶颈模块。然后，引入</w:t>
-            </w:r>
-            <w:proofErr w:type="spellStart"/>
-            <w:r>
-              <w:rPr>
-                <w:rFonts w:ascii="宋体" w:hAnsi="宋体" w:cs="宋体"/>
-                <w:kern w:val="0"/>
-                <w:sz w:val="24"/>
-              </w:rPr>
-              <w:t>GhostNet</w:t>
-            </w:r>
-            <w:proofErr w:type="spellEnd"/>
-            <w:r>
-              <w:rPr>
-                <w:rFonts w:ascii="宋体" w:hAnsi="宋体" w:cs="宋体"/>
-                <w:kern w:val="0"/>
-                <w:sz w:val="24"/>
-              </w:rPr>
-              <w:t>的核心思想，设计一种新的轻量化模块来替代原有的高计算复杂度模块，以降低模型的参数量和计算量。同时，为了弥补轻量化可能带来的精度损失并增强模型对小目标的检测能力，选择并集成一种高效的注意力机制，优化网络对病害关键特征的捕捉能力。最终，将两种改进策略相结合，构建一个全新的、改进的YOLOv12检测模型。整个研究将依托公开的RDD2022道路病害数据集进行模型的训练、验证和测试，并通过全面的消融实验和对比实验，系统地评估所提方法的有效性和优越性。</w:t>
+              <w:t>本研究的核心思路是以最新的YOLOv12模型为基础，针对道路病害检测任务在边缘设备上部署时对实时性和高精度的双重需求，从模型轻量化和特征增强两个维度进行深度改进。首先，对YOLOv12的网络结构进行详细解析，识别其关键计算瓶颈模块。然后，引入GhostNet的核心思想，设计一种新的轻量化模块来替代原有的高计算复杂度模块，以降低模型的参数量和计算量。同时，为了弥补轻量化可能带来的精度损失并增强模型对小目标的检测能力，选择并集成一种高效的注意力机制，优化网络对病害关键特征的捕捉能力。最终，将两种改进策略相结合，构建一个全新的、改进的YOLOv12检测模型。整个研究将依托公开的RDD2022道路病害数据集进行模型的训练、验证和测试，并通过全面的消融实验和对比实验，系统地评估所提方法的有效性和优越性。</w:t>
             </w:r>
           </w:p>
           <w:p>
@@ -2046,25 +1860,7 @@
                 <w:kern w:val="0"/>
                 <w:sz w:val="24"/>
               </w:rPr>
-              <w:t>本研究将采用国际权威的RDD2022（Road Damage Detection 2022）数据集作为实验数据。该数据集包含了来自全球多个国家的超过4万张道路图像，涵盖了多种类型和不同严重程度的病害，场景多样，极具挑战性。在模型训练阶段，将采用迁移学习策略，加载YOLOv12的预训练权重进行初始化，并结合Mosaic、</w:t>
-            </w:r>
-            <w:proofErr w:type="spellStart"/>
-            <w:r>
-              <w:rPr>
-                <w:rFonts w:ascii="宋体" w:hAnsi="宋体" w:cs="宋体"/>
-                <w:kern w:val="0"/>
-                <w:sz w:val="24"/>
-              </w:rPr>
-              <w:t>MixUp</w:t>
-            </w:r>
-            <w:proofErr w:type="spellEnd"/>
-            <w:r>
-              <w:rPr>
-                <w:rFonts w:ascii="宋体" w:hAnsi="宋体" w:cs="宋体"/>
-                <w:kern w:val="0"/>
-                <w:sz w:val="24"/>
-              </w:rPr>
-              <w:t>等先进的数据增强技术来提升模型的泛化能力。</w:t>
+              <w:t>本研究将采用国际权威的RDD2022（Road Damage Detection 2022）数据集作为实验数据。该数据集包含了来自全球多个国家的超过4万张道路图像，涵盖了多种类型和不同严重程度的病害，场景多样，极具挑战性。在模型训练阶段，将采用迁移学习策略，加载YOLOv12的预训练权重进行初始化，并结合Mosaic、MixUp等先进的数据增强技术来提升模型的泛化能力。</w:t>
             </w:r>
           </w:p>
           <w:p>
@@ -2105,25 +1901,7 @@
                 <w:kern w:val="0"/>
                 <w:sz w:val="24"/>
               </w:rPr>
-              <w:t>深入分析YOLOv12的网络结构，定位其骨干网络（Backbone）或颈部网络（Neck）中计算量密集的核心模块（例如C3K2或其在YOLOv12中的等效高级模块）。本研究拟借鉴</w:t>
-            </w:r>
-            <w:proofErr w:type="spellStart"/>
-            <w:r>
-              <w:rPr>
-                <w:rFonts w:ascii="宋体" w:hAnsi="宋体" w:cs="宋体"/>
-                <w:kern w:val="0"/>
-                <w:sz w:val="24"/>
-              </w:rPr>
-              <w:t>GhostNet</w:t>
-            </w:r>
-            <w:proofErr w:type="spellEnd"/>
-            <w:r>
-              <w:rPr>
-                <w:rFonts w:ascii="宋体" w:hAnsi="宋体" w:cs="宋体"/>
-                <w:kern w:val="0"/>
-                <w:sz w:val="24"/>
-              </w:rPr>
-              <w:t>的设计哲学，提出一种名为C3Ghost_K2的轻量化瓶颈模块。该模块将原始模块中的标准卷积操作分解为两步：首先，使用少量标准卷积核生成一部分“内在”特征图；然后，对这些内在特征图施加一系列计算成本极低的线性变换（如深度可分离卷积），以生成更多的“幽灵”特征图。最后，将内在特征图与幽灵特征图进行拼接（Concatenate），共同构成输出特征。通过这种方式，可以在显著减少模型参数量和FLOPs的同时，最大限度地保留原有的特征提取能力，从而在不牺牲过多精度的前提下，大幅提升模型的推理速度。</w:t>
+              <w:t>深入分析YOLOv12的网络结构，定位其骨干网络（Backbone）或颈部网络（Neck）中计算量密集的核心模块（例如C3K2或其在YOLOv12中的等效高级模块）。本研究拟借鉴GhostNet的设计哲学，提出一种名为C3Ghost_K2的轻量化瓶颈模块。该模块将原始模块中的标准卷积操作分解为两步：首先，使用少量标准卷积核生成一部分“内在”特征图；然后，对这些内在特征图施加一系列计算成本极低的线性变换（如深度可分离卷积），以生成更多的“幽灵”特征图。最后，将内在特征图与幽灵特征图进行拼接（Concatenate），共同构成输出特征。通过这种方式，可以在显著减少模型参数量和FLOPs的同时，最大限度地保留原有的特征提取能力，从而在不牺牲过多精度的前提下，大幅提升模型的推理速度。</w:t>
             </w:r>
           </w:p>
           <w:p>
@@ -2340,21 +2118,7 @@
               <w:rPr>
                 <w:rFonts w:asciiTheme="minorEastAsia" w:eastAsiaTheme="minorEastAsia" w:hAnsiTheme="minorEastAsia"/>
               </w:rPr>
-              <w:t>为解决YOLOv12在边缘设备上部署时面临的计算资源瓶颈，提出一种轻量化改进策略。深入剖析YOLOv12网络结构，定位其计算密集型核心模块C3K2。借鉴</w:t>
-            </w:r>
-            <w:proofErr w:type="spellStart"/>
-            <w:r>
-              <w:rPr>
-                <w:rFonts w:asciiTheme="minorEastAsia" w:eastAsiaTheme="minorEastAsia" w:hAnsiTheme="minorEastAsia"/>
-              </w:rPr>
-              <w:t>GhostNet</w:t>
-            </w:r>
-            <w:proofErr w:type="spellEnd"/>
-            <w:r>
-              <w:rPr>
-                <w:rFonts w:asciiTheme="minorEastAsia" w:eastAsiaTheme="minorEastAsia" w:hAnsiTheme="minorEastAsia"/>
-              </w:rPr>
-              <w:t>关于特征图冗余性的核心洞察，</w:t>
+              <w:t>为解决YOLOv12在边缘设备上部署时面临的计算资源瓶颈，提出一种轻量化改进策略。深入剖析YOLOv12网络结构，定位其计算密集型核心模块C3K2。借鉴GhostNet关于特征图冗余性的核心洞察，</w:t>
             </w:r>
             <w:r>
               <w:rPr>
@@ -2712,21 +2476,7 @@
               <w:rPr>
                 <w:rFonts w:asciiTheme="minorEastAsia" w:eastAsiaTheme="minorEastAsia" w:hAnsiTheme="minorEastAsia"/>
               </w:rPr>
-              <w:t>实验平台： 实验将在高性能计算服务器上进行，硬件配置为NVIDIA RTX 40系列或同等级别GPU，软件环境为Ubuntu操作系统，采用</w:t>
-            </w:r>
-            <w:proofErr w:type="spellStart"/>
-            <w:r>
-              <w:rPr>
-                <w:rFonts w:asciiTheme="minorEastAsia" w:eastAsiaTheme="minorEastAsia" w:hAnsiTheme="minorEastAsia"/>
-              </w:rPr>
-              <w:t>PyTorch</w:t>
-            </w:r>
-            <w:proofErr w:type="spellEnd"/>
-            <w:r>
-              <w:rPr>
-                <w:rFonts w:asciiTheme="minorEastAsia" w:eastAsiaTheme="minorEastAsia" w:hAnsiTheme="minorEastAsia"/>
-              </w:rPr>
-              <w:t>深度学习框架进行模型搭建与训练。</w:t>
+              <w:t>实验平台： 实验将在高性能计算服务器上进行，硬件配置为NVIDIA RTX 40系列或同等级别GPU，软件环境为Ubuntu操作系统，采用PyTorch深度学习框架进行模型搭建与训练。</w:t>
             </w:r>
           </w:p>
           <w:p>
@@ -3029,23 +2779,7 @@
                 <w:rFonts w:asciiTheme="minorEastAsia" w:eastAsiaTheme="minorEastAsia" w:hAnsiTheme="minorEastAsia"/>
                 <w:bCs/>
               </w:rPr>
-              <w:t>本人已通过研究生阶段的课程学习，掌握了深度学习、计算机视觉和数字图像处理等领域的扎实理论基础。熟练掌握Python编程语言以及</w:t>
-            </w:r>
-            <w:proofErr w:type="spellStart"/>
-            <w:r>
-              <w:rPr>
-                <w:rFonts w:asciiTheme="minorEastAsia" w:eastAsiaTheme="minorEastAsia" w:hAnsiTheme="minorEastAsia"/>
-                <w:bCs/>
-              </w:rPr>
-              <w:t>PyTorch</w:t>
-            </w:r>
-            <w:proofErr w:type="spellEnd"/>
-            <w:r>
-              <w:rPr>
-                <w:rFonts w:asciiTheme="minorEastAsia" w:eastAsiaTheme="minorEastAsia" w:hAnsiTheme="minorEastAsia"/>
-                <w:bCs/>
-              </w:rPr>
-              <w:t>等深度学习框架，具备独立进行模型设计、代码实现、实验调试与数据分析的能力。已对YOLO系列目标检测算法的发展脉络和核心原理进行了系统性的学习，并对模型轻量化及注意力机制等前沿技术进行了广泛的文献调研，为本课题的顺利开展奠定了坚实的基础。</w:t>
+              <w:t>本人已通过研究生阶段的课程学习，掌握了深度学习、计算机视觉和数字图像处理等领域的扎实理论基础。熟练掌握Python编程语言以及PyTorch等深度学习框架，具备独立进行模型设计、代码实现、实验调试与数据分析的能力。已对YOLO系列目标检测算法的发展脉络和核心原理进行了系统性的学习，并对模型轻量化及注意力机制等前沿技术进行了广泛的文献调研，为本课题的顺利开展奠定了坚实的基础。</w:t>
             </w:r>
           </w:p>
           <w:p>
@@ -3171,23 +2905,7 @@
                 <w:rFonts w:asciiTheme="minorEastAsia" w:eastAsiaTheme="minorEastAsia" w:hAnsiTheme="minorEastAsia"/>
                 <w:bCs/>
               </w:rPr>
-              <w:t>针对问题一，本研究将通过引入</w:t>
-            </w:r>
-            <w:proofErr w:type="spellStart"/>
-            <w:r>
-              <w:rPr>
-                <w:rFonts w:asciiTheme="minorEastAsia" w:eastAsiaTheme="minorEastAsia" w:hAnsiTheme="minorEastAsia"/>
-                <w:bCs/>
-              </w:rPr>
-              <w:t>GhostNet</w:t>
-            </w:r>
-            <w:proofErr w:type="spellEnd"/>
-            <w:r>
-              <w:rPr>
-                <w:rFonts w:asciiTheme="minorEastAsia" w:eastAsiaTheme="minorEastAsia" w:hAnsiTheme="minorEastAsia"/>
-                <w:bCs/>
-              </w:rPr>
-              <w:t>的设计思想，对YOLOv12的关键计算模块进行轻量化改造，旨在构建一个参数更少、计算更快的新模型架构，以满足实时检测的需求。</w:t>
+              <w:t>针对问题一，本研究将通过引入GhostNet的设计思想，对YOLOv12的关键计算模块进行轻量化改造，旨在构建一个参数更少、计算更快的新模型架构，以满足实时检测的需求。</w:t>
             </w:r>
           </w:p>
           <w:p>

</xml_diff>

<commit_message>
vault backup: 2025-09-26 20:03:15
</commit_message>
<xml_diff>
--- a/学校/刘非凡选题报告 .docx
+++ b/学校/刘非凡选题报告 .docx
@@ -116,7 +116,7 @@
           </mc:Choice>
           <mc:Fallback>
             <w:pict>
-              <v:group w14:anchorId="30F5C62C" id="Group 24" o:spid="_x0000_s1026" style="position:absolute;margin-left:63pt;margin-top:11.7pt;width:324pt;height:124.8pt;z-index:251659264" coordsize="6480,2964" o:gfxdata="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">
+              <v:group w14:anchorId="6827580F" id="Group 24" o:spid="_x0000_s1026" style="position:absolute;margin-left:63pt;margin-top:11.7pt;width:324pt;height:124.8pt;z-index:251659264" coordsize="6480,2964" o:gfxdata="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">
                 <o:lock v:ext="edit" aspectratio="t"/>
                 <v:shapetype id="_x0000_t75" coordsize="21600,21600" o:spt="75" o:preferrelative="t" path="m@4@5l@4@11@9@11@9@5xe" filled="f" stroked="f">
                   <v:stroke joinstyle="miter"/>
@@ -717,6 +717,7 @@
                 <w:szCs w:val="28"/>
               </w:rPr>
             </w:pPr>
+            <w:proofErr w:type="gramStart"/>
             <w:r>
               <w:rPr>
                 <w:rFonts w:ascii="宋体" w:hAnsi="宋体" w:cs="宋体" w:hint="eastAsia"/>
@@ -725,6 +726,7 @@
               </w:rPr>
               <w:t>车生兵</w:t>
             </w:r>
+            <w:proofErr w:type="gramEnd"/>
           </w:p>
         </w:tc>
       </w:tr>
@@ -1495,7 +1497,25 @@
                 <w:kern w:val="0"/>
                 <w:sz w:val="24"/>
               </w:rPr>
-              <w:t>随着全球城市化进程的不断加速和机动车保有量的持续攀升，现代社会对交通运输系统的依赖程度达到了前所未有的高度。在这一宏观背景下，道路作为最基础也是最重要的交通基础设施，其健康状况与运营状态已成为直接关系到交通安全、通行效率、物流成本乃至区域经济发展的核心命和关键因素。然而，道路结构在其整个生命周期中，长期承受着往复式车辆荷载的碾压、经受着温度变化、雨水侵蚀、紫外线辐射等多种自然环境因素的综合作用，其性能会不可避免地发生退化，进而产生裂缝、坑洞、网裂、沉降等多种形式的病害。</w:t>
+              <w:t>随着全球城市化进程的不断加速和机动车保有量的持续攀升，现代社会对交通运输系统的依赖程度达到了前所未有的高度。在这一宏观背景下，道路作为</w:t>
+            </w:r>
+            <w:proofErr w:type="gramStart"/>
+            <w:r>
+              <w:rPr>
+                <w:rFonts w:ascii="宋体" w:hAnsi="宋体" w:cs="宋体"/>
+                <w:kern w:val="0"/>
+                <w:sz w:val="24"/>
+              </w:rPr>
+              <w:t>最</w:t>
+            </w:r>
+            <w:proofErr w:type="gramEnd"/>
+            <w:r>
+              <w:rPr>
+                <w:rFonts w:ascii="宋体" w:hAnsi="宋体" w:cs="宋体"/>
+                <w:kern w:val="0"/>
+                <w:sz w:val="24"/>
+              </w:rPr>
+              <w:t>基础也是最重要的交通基础设施，其健康状况与运营状态已成为直接关系到交通安全、通行效率、物流成本乃至区域经济发展的核心命和关键因素。然而，道路结构在其整个生命周期中，长期承受着往复式车辆荷载的碾压、经受着温度变化、雨水侵蚀、紫外线辐射等多种自然环境因素的综合作用，其性能会不可避免地发生退化，进而产生裂缝、坑洞、网裂、沉降等多种形式的病害。</w:t>
             </w:r>
           </w:p>
           <w:p>
@@ -1555,7 +1575,43 @@
                 <w:kern w:val="0"/>
                 <w:sz w:val="24"/>
               </w:rPr>
-              <w:t>深度学习，特别是卷积神经网络（CNN），彻底改变了这一局面。它通过构建深层网络结构，能够从海量的图像数据中自动、端到端地学习从低阶（如边缘、角点）到高阶（如病害的特定形状、纹理组合）的抽象特征，无需繁琐的人工特征工程。这种数据驱动的特征学习方式使得模型能够捕捉到病害更为本质和稳健的视觉表达，从而实现对复杂背景下道路病害的快速识别与精确定位，其性能显著优于传统的图像处理方法。在众多深度学习目标检测算法中，YOLO（You Only Look Once）系列算法凭借其独特的设计理念脱颖而出。它创造性地将目标检测任务视为一个单一的回归问题，直接从整幅图像中同步预测边界框位置和类别概率，实现了速度与精度的卓越平衡，成为实时目标检测领域的标杆。</w:t>
+              <w:t>深度学习，特别是卷积神经网络（CNN），彻底改变了这一局面。它通过构建深层网络结构，能够从海量的图像数据中自动、</w:t>
+            </w:r>
+            <w:proofErr w:type="gramStart"/>
+            <w:r>
+              <w:rPr>
+                <w:rFonts w:ascii="宋体" w:hAnsi="宋体" w:cs="宋体"/>
+                <w:kern w:val="0"/>
+                <w:sz w:val="24"/>
+              </w:rPr>
+              <w:t>端到端地学习</w:t>
+            </w:r>
+            <w:proofErr w:type="gramEnd"/>
+            <w:r>
+              <w:rPr>
+                <w:rFonts w:ascii="宋体" w:hAnsi="宋体" w:cs="宋体"/>
+                <w:kern w:val="0"/>
+                <w:sz w:val="24"/>
+              </w:rPr>
+              <w:t>从低阶（如边缘、角点）到高阶（如病害的特定形状、纹理组合）的抽象特征，无需繁琐的人工特征工程。这种数据驱动的特征学习方式使得模型能够捕捉到病害更为本质和稳健的视觉表达，从而实现对复杂背景下道路病害的快速识别与精确定位，其性能显著优于传统的图像处理方法。在众多深度学习目标检测算法中，YOLO（You Only Look Once）系列算法凭借其独特的设计理念脱颖而出。它创造性地将目标检测任务视为一个单一的回归问题，直接从整幅图像中同步预测边界</w:t>
+            </w:r>
+            <w:proofErr w:type="gramStart"/>
+            <w:r>
+              <w:rPr>
+                <w:rFonts w:ascii="宋体" w:hAnsi="宋体" w:cs="宋体"/>
+                <w:kern w:val="0"/>
+                <w:sz w:val="24"/>
+              </w:rPr>
+              <w:t>框位置</w:t>
+            </w:r>
+            <w:proofErr w:type="gramEnd"/>
+            <w:r>
+              <w:rPr>
+                <w:rFonts w:ascii="宋体" w:hAnsi="宋体" w:cs="宋体"/>
+                <w:kern w:val="0"/>
+                <w:sz w:val="24"/>
+              </w:rPr>
+              <w:t>和类别概率，实现了速度与精度的卓越平衡，成为实时目标检测领域的标杆。</w:t>
             </w:r>
           </w:p>
           <w:p>
@@ -1596,91 +1652,409 @@
           </w:p>
           <w:p>
             <w:pPr>
-              <w:widowControl/>
+              <w:pStyle w:val="af5"/>
+              <w:numPr>
+                <w:ilvl w:val="2"/>
+                <w:numId w:val="17"/>
+              </w:numPr>
               <w:spacing w:beforeLines="50" w:before="156" w:afterLines="50" w:after="156"/>
-              <w:ind w:firstLineChars="200" w:firstLine="480"/>
-              <w:rPr>
-                <w:rFonts w:ascii="宋体" w:hAnsi="宋体" w:cs="宋体"/>
-                <w:kern w:val="0"/>
-                <w:sz w:val="24"/>
-              </w:rPr>
-            </w:pPr>
-            <w:r>
-              <w:rPr>
-                <w:rFonts w:ascii="宋体" w:hAnsi="宋体" w:cs="宋体"/>
-                <w:kern w:val="0"/>
-                <w:sz w:val="24"/>
-              </w:rPr>
-              <w:t>道路病害检测技术的发展大致经历了两个阶段。早期研究主要集中于传统的数字图像处理技术，例如研究人员利用边缘检测算子（如Canny、Sobel）来识别裂缝的轮廓，或通过阈值分割、形态学处理等方法来提取坑洞等区域特征。这些方法在简单的场景下能够取得一定的效果，但其严重依赖于人工设计的特征提取器，且对光照变化、路面阴影、水渍等噪声极为敏感，导致模型的鲁棒性和泛化能力严重不足，难以适应真实多变的道路环境。</w:t>
-            </w:r>
-          </w:p>
-          <w:p>
-            <w:pPr>
-              <w:widowControl/>
+              <w:ind w:right="-295" w:firstLineChars="0"/>
+              <w:rPr>
+                <w:rFonts w:ascii="黑体" w:eastAsia="黑体" w:hAnsi="黑体"/>
+              </w:rPr>
+            </w:pPr>
+            <w:r>
+              <w:rPr>
+                <w:rFonts w:ascii="黑体" w:eastAsia="黑体" w:hAnsi="黑体" w:hint="eastAsia"/>
+              </w:rPr>
+              <w:t>基于传统图像处理的检测方法</w:t>
+            </w:r>
+          </w:p>
+          <w:p>
+            <w:pPr>
+              <w:pStyle w:val="af5"/>
               <w:spacing w:beforeLines="50" w:before="156" w:afterLines="50" w:after="156"/>
-              <w:ind w:firstLineChars="200" w:firstLine="480"/>
-              <w:rPr>
-                <w:rFonts w:ascii="宋体" w:hAnsi="宋体" w:cs="宋体"/>
-                <w:kern w:val="0"/>
-                <w:sz w:val="24"/>
-              </w:rPr>
-            </w:pPr>
-            <w:r>
-              <w:rPr>
-                <w:rFonts w:ascii="宋体" w:hAnsi="宋体" w:cs="宋体"/>
-                <w:kern w:val="0"/>
-                <w:sz w:val="24"/>
-              </w:rPr>
-              <w:t>进入深度学习时代后，目标检测算法的发展为道路病害检测带来了革命性的突破。其技术路线主要分为两大流派：一类是以R-CNN系列、Faster R-CNN为代表的两阶段检测算法。该类算法首先生成候选区域（Region Proposal），再对候选区域进行分类和位置回归，检测精度较高，但推理速度较慢，难以满足实时性要求。另一类是以SSD和YOLO系列为代表的单阶段检测算法，它们将检测问题转化为一个端到端的回归问题，直接预测目标的类别和边界框，实现了速度与精度的有效平衡。特别是YOLO算法，从最初的YOLOv1、v2，发展到YOLOv3、YOLOv5、YOLOv8等广为人知的版本，其网络结构、损失函数和训练策略不断演进，性能持续提升，已成为工业界和学术界实时检测任务的首选框架。许多研究工作已成功将YOLO模型应用于道路病害检测，并取得了显著成果。然而，在实际部署中，尤其是在车载边缘计算设备上，现有模型仍面临挑战，即如何在有限的计算资源下，进一步提升对微小裂缝、形态不规则病害的检测精度，同时保持甚至超越原有的推理速度。</w:t>
-            </w:r>
-          </w:p>
-          <w:p>
-            <w:pPr>
-              <w:widowControl/>
+              <w:ind w:firstLine="480"/>
+            </w:pPr>
+            <w:r>
+              <w:rPr>
+                <w:rFonts w:hint="eastAsia"/>
+              </w:rPr>
+              <w:t>在深度学习兴起之前，道路病害的自动化检测主要依赖于传统的数字图像处理技术。这一阶段的研究核心在于设计精巧的人工特征提取器。例如，研究人员常利用Canny、Sobel等边缘检测算子来勾勒裂缝的轮廓，或采用阈值分割方法（如Otsu法）</w:t>
+            </w:r>
+            <w:proofErr w:type="gramStart"/>
+            <w:r>
+              <w:rPr>
+                <w:rFonts w:hint="eastAsia"/>
+              </w:rPr>
+              <w:t>尝试将坑洞</w:t>
+            </w:r>
+            <w:proofErr w:type="gramEnd"/>
+            <w:r>
+              <w:rPr>
+                <w:rFonts w:hint="eastAsia"/>
+              </w:rPr>
+              <w:t>等病害区域从复杂的路面背景中分离出来。此外，形态学处理、小波变换等技术亦被用于进一步处理和增强病害特征。</w:t>
+            </w:r>
+          </w:p>
+          <w:p>
+            <w:pPr>
+              <w:pStyle w:val="af5"/>
               <w:spacing w:beforeLines="50" w:before="156" w:afterLines="50" w:after="156"/>
-              <w:ind w:firstLineChars="200" w:firstLine="480"/>
-              <w:rPr>
-                <w:rFonts w:ascii="宋体" w:hAnsi="宋体" w:cs="宋体"/>
-                <w:kern w:val="0"/>
-                <w:sz w:val="24"/>
-              </w:rPr>
-            </w:pPr>
-            <w:r>
-              <w:rPr>
-                <w:rFonts w:ascii="宋体" w:hAnsi="宋体" w:cs="宋体"/>
-                <w:kern w:val="0"/>
-                <w:sz w:val="24"/>
-              </w:rPr>
-              <w:t>为了应对这一挑战，学术界和工业界正从两个主要方向进行探索。其一是模型轻量化设计，旨在降低模型的参数量和计算复杂度（FLOPs）。以MobileNet系列、ShuffleNet和GhostNet为代表的轻量级网络架构，通过引入深度可分离卷积、通道混洗、幽灵模块（Ghost Module）等创新设计，在保证模型性能的同时，极大地压缩了模型体积，为深度学习模型在移动端和嵌入式设备上的应用铺平了道路。其二是通过注意力机制（Attention Mechanism）强化模型的特征表达能力。该机制模仿人类视觉系统，使模型能够自适应地聚焦于图像中的关键信息。从开创性的SE-Net，到融合了通道与空间注意力的CBAM，再到近期提出的无需额外参数的SimAM，注意力机制已被证明能够有效提升模型对小目标、遮挡目标的识别能力。</w:t>
-            </w:r>
-          </w:p>
-          <w:p>
-            <w:pPr>
-              <w:widowControl/>
+              <w:ind w:firstLine="480"/>
+            </w:pPr>
+            <w:r>
+              <w:rPr>
+                <w:rFonts w:hint="eastAsia"/>
+              </w:rPr>
+              <w:t>然而，这些传统方法在实际应用中暴露出显著的局限性。首先，其性能严重依赖于人工设计的特征，这些特征往往只在特定场景下有效，导致模型的泛化能力和鲁棒性严重不足。其次，它们对真实道路环境中常见的光照突变、路面阴影、水渍及污渍等噪声干扰极为敏感，容易产生大量的虚警和漏检。最后，复杂的算法流程和繁琐的参数调校过程，使得这些方法难以适应形态各异、尺寸不一的病害类型以及千变万化的道路条件，限制了其大规模部署的可能。</w:t>
+            </w:r>
+          </w:p>
+          <w:p>
+            <w:pPr>
+              <w:pStyle w:val="af5"/>
+              <w:numPr>
+                <w:ilvl w:val="2"/>
+                <w:numId w:val="17"/>
+              </w:numPr>
               <w:spacing w:beforeLines="50" w:before="156" w:afterLines="50" w:after="156"/>
-              <w:ind w:firstLineChars="200" w:firstLine="480"/>
-              <w:rPr>
-                <w:rFonts w:ascii="宋体" w:hAnsi="宋体" w:cs="宋体"/>
-                <w:kern w:val="0"/>
-                <w:sz w:val="24"/>
-              </w:rPr>
-            </w:pPr>
-            <w:r>
-              <w:rPr>
-                <w:rFonts w:ascii="宋体" w:hAnsi="宋体" w:cs="宋体"/>
-                <w:kern w:val="0"/>
-                <w:sz w:val="24"/>
-              </w:rPr>
-              <w:t>在此背景下，最新的YOLOv12模型横空出世，其通过对网络结构的进一步优化，在多个基准数据集上展现了超越以往版本的卓越性能。尽管YOLOv12的性能强大，但其计算开销对于资源受限的边缘设备而言仍有优化空间。此外，对于道路病害这类具有多尺度、小目标、形态不规则等特性的检测任务，其特征提取和融合能力仍有进一步提升的潜力。因此，本研究选择YOLOv12作为基线模型，旨在通过对其进行针对性的轻量化改造和注意力机制融合，探索一种在检测精度和推理速度上达到更优平衡的道路病害实时检测新方法。</w:t>
-            </w:r>
-          </w:p>
-          <w:p>
-            <w:pPr>
-              <w:spacing w:line="300" w:lineRule="exact"/>
-              <w:rPr>
-                <w:sz w:val="24"/>
-              </w:rPr>
-            </w:pPr>
+              <w:ind w:right="-295" w:firstLineChars="0"/>
+              <w:rPr>
+                <w:rFonts w:ascii="黑体" w:eastAsia="黑体" w:hAnsi="黑体"/>
+              </w:rPr>
+            </w:pPr>
+            <w:r>
+              <w:rPr>
+                <w:rFonts w:ascii="黑体" w:eastAsia="黑体" w:hAnsi="黑体" w:hint="eastAsia"/>
+              </w:rPr>
+              <w:t>基于深度学习的检测方法</w:t>
+            </w:r>
+          </w:p>
+          <w:p>
+            <w:pPr>
+              <w:pStyle w:val="af5"/>
+              <w:spacing w:beforeLines="50" w:before="156" w:afterLines="50" w:after="156"/>
+              <w:ind w:firstLine="480"/>
+            </w:pPr>
+            <w:r>
+              <w:rPr>
+                <w:rFonts w:hint="eastAsia"/>
+              </w:rPr>
+              <w:t>随着卷积神经网络（CNN）的突破性进展，深度学习为道路病害检测带来了革命性的变革，并迅速成为该领域的主流技术路线。基于深度学习的目标检测算法主要沿着两条技术脉络发展：</w:t>
+            </w:r>
+          </w:p>
+          <w:p>
+            <w:pPr>
+              <w:pStyle w:val="af5"/>
+              <w:spacing w:beforeLines="50" w:before="156" w:afterLines="50" w:after="156"/>
+              <w:ind w:firstLine="480"/>
+            </w:pPr>
+            <w:r>
+              <w:rPr>
+                <w:rFonts w:hint="eastAsia"/>
+              </w:rPr>
+              <w:t>其一是</w:t>
+            </w:r>
+            <w:r>
+              <w:rPr>
+                <w:rFonts w:hint="eastAsia"/>
+                <w:b/>
+                <w:bCs/>
+              </w:rPr>
+              <w:t>两阶段检测算法</w:t>
+            </w:r>
+            <w:r>
+              <w:rPr>
+                <w:rFonts w:hint="eastAsia"/>
+              </w:rPr>
+              <w:t>。该流派以R-CNN系列（包括Fast R-CNN、Faster R-CNN等）为开山之作和杰出代表。其核心思想是“先提议后分类”，即首先通过一个独立的网络（如Region Proposal Network, RPN）生成大量可能包含目标的候选区域，然后对这些候选区域进行精确的分类和边界框回归。两阶段算法通常能够达到很高的检测精度，但其多步骤的流程导致计算开销较大，推理速度相对较慢，难以满足道路巡检等任务的实时性要求。</w:t>
+            </w:r>
+          </w:p>
+          <w:p>
+            <w:pPr>
+              <w:pStyle w:val="af5"/>
+              <w:spacing w:beforeLines="50" w:before="156" w:afterLines="50" w:after="156"/>
+              <w:ind w:firstLine="480"/>
+            </w:pPr>
+            <w:r>
+              <w:rPr>
+                <w:rFonts w:hint="eastAsia"/>
+              </w:rPr>
+              <w:t>其二是</w:t>
+            </w:r>
+            <w:proofErr w:type="gramStart"/>
+            <w:r>
+              <w:rPr>
+                <w:rFonts w:hint="eastAsia"/>
+                <w:b/>
+                <w:bCs/>
+              </w:rPr>
+              <w:t>单阶段</w:t>
+            </w:r>
+            <w:proofErr w:type="gramEnd"/>
+            <w:r>
+              <w:rPr>
+                <w:rFonts w:hint="eastAsia"/>
+                <w:b/>
+                <w:bCs/>
+              </w:rPr>
+              <w:t>检测算法</w:t>
+            </w:r>
+            <w:r>
+              <w:rPr>
+                <w:rFonts w:hint="eastAsia"/>
+              </w:rPr>
+              <w:t>。为了解决两阶段算法的速度瓶颈，研究者们提出了将目标检测视为一个端到</w:t>
+            </w:r>
+            <w:proofErr w:type="gramStart"/>
+            <w:r>
+              <w:rPr>
+                <w:rFonts w:hint="eastAsia"/>
+              </w:rPr>
+              <w:t>端回归</w:t>
+            </w:r>
+            <w:proofErr w:type="gramEnd"/>
+            <w:r>
+              <w:rPr>
+                <w:rFonts w:hint="eastAsia"/>
+              </w:rPr>
+              <w:t>问题的</w:t>
+            </w:r>
+            <w:proofErr w:type="gramStart"/>
+            <w:r>
+              <w:rPr>
+                <w:rFonts w:hint="eastAsia"/>
+              </w:rPr>
+              <w:t>单阶段</w:t>
+            </w:r>
+            <w:proofErr w:type="gramEnd"/>
+            <w:r>
+              <w:rPr>
+                <w:rFonts w:hint="eastAsia"/>
+              </w:rPr>
+              <w:t xml:space="preserve">算法。该流派以SSD（Single Shot </w:t>
+            </w:r>
+            <w:proofErr w:type="spellStart"/>
+            <w:r>
+              <w:rPr>
+                <w:rFonts w:hint="eastAsia"/>
+              </w:rPr>
+              <w:t>MultiBox</w:t>
+            </w:r>
+            <w:proofErr w:type="spellEnd"/>
+            <w:r>
+              <w:rPr>
+                <w:rFonts w:hint="eastAsia"/>
+              </w:rPr>
+              <w:t xml:space="preserve"> Detector）和YOLO（You Only Look Once）系列为代表，它们</w:t>
+            </w:r>
+            <w:proofErr w:type="gramStart"/>
+            <w:r>
+              <w:rPr>
+                <w:rFonts w:hint="eastAsia"/>
+              </w:rPr>
+              <w:t>取消了显式</w:t>
+            </w:r>
+            <w:proofErr w:type="gramEnd"/>
+            <w:r>
+              <w:rPr>
+                <w:rFonts w:hint="eastAsia"/>
+              </w:rPr>
+              <w:t>的候选区域生成步骤，直接在整张图像上预测目标的类别和位置。这种设计极大地提升了检测速度，实现了速度与精度的有效平衡。</w:t>
+            </w:r>
+          </w:p>
+          <w:p>
+            <w:pPr>
+              <w:pStyle w:val="af5"/>
+              <w:spacing w:beforeLines="50" w:before="156" w:afterLines="50" w:after="156"/>
+              <w:ind w:firstLine="480"/>
+            </w:pPr>
+            <w:r>
+              <w:rPr>
+                <w:rFonts w:hint="eastAsia"/>
+              </w:rPr>
+              <w:t>特别是YOLO系列，自诞生以来经历了持续且快速的迭代演进。从开创性的YOLOv1，到引入多尺度预测和更优骨干网络的YOLOv3，再到在工程实践中取得巨大成功、广为人知的YOLOv5和引入Anchor-Free设计的YOLOv8，其网络结构、损失函数和训练策略不断被优化，性能持续攀升。YOLO框架已成为工业界和学术界实时检测任务的事实标准，无数研究工作已成功将其应用于道路病害检测并取得了显著的成果。</w:t>
+            </w:r>
+          </w:p>
+          <w:p>
+            <w:pPr>
+              <w:pStyle w:val="af5"/>
+              <w:spacing w:beforeLines="50" w:before="156" w:afterLines="50" w:after="156"/>
+              <w:ind w:firstLine="480"/>
+            </w:pPr>
+            <w:r>
+              <w:rPr>
+                <w:rFonts w:hint="eastAsia"/>
+              </w:rPr>
+              <w:t>尽管深度学习模型性能强大，但在实际部署中，尤其是</w:t>
+            </w:r>
+            <w:proofErr w:type="gramStart"/>
+            <w:r>
+              <w:rPr>
+                <w:rFonts w:hint="eastAsia"/>
+              </w:rPr>
+              <w:t>在算力受限</w:t>
+            </w:r>
+            <w:proofErr w:type="gramEnd"/>
+            <w:r>
+              <w:rPr>
+                <w:rFonts w:hint="eastAsia"/>
+              </w:rPr>
+              <w:t>的车载边缘计算设备上，模型的大小和计算复杂</w:t>
+            </w:r>
+            <w:proofErr w:type="gramStart"/>
+            <w:r>
+              <w:rPr>
+                <w:rFonts w:hint="eastAsia"/>
+              </w:rPr>
+              <w:t>度成为</w:t>
+            </w:r>
+            <w:proofErr w:type="gramEnd"/>
+            <w:r>
+              <w:rPr>
+                <w:rFonts w:hint="eastAsia"/>
+              </w:rPr>
+              <w:t>关键瓶颈。为了应对这一挑战，学术界和工业界正从两个主要方向进行探索。</w:t>
+            </w:r>
+          </w:p>
+          <w:p>
+            <w:pPr>
+              <w:pStyle w:val="af5"/>
+              <w:spacing w:beforeLines="50" w:before="156" w:afterLines="50" w:after="156"/>
+              <w:ind w:firstLine="480"/>
+            </w:pPr>
+            <w:r>
+              <w:rPr>
+                <w:rFonts w:hint="eastAsia"/>
+              </w:rPr>
+              <w:t>一方面是模型轻量化设计，其目标是在维持甚至提升精度的前提下，显著降低模型的参数量和计算量（FLOPs）。以</w:t>
+            </w:r>
+            <w:proofErr w:type="spellStart"/>
+            <w:r>
+              <w:rPr>
+                <w:rFonts w:hint="eastAsia"/>
+              </w:rPr>
+              <w:t>MobileNet</w:t>
+            </w:r>
+            <w:proofErr w:type="spellEnd"/>
+            <w:r>
+              <w:rPr>
+                <w:rFonts w:hint="eastAsia"/>
+              </w:rPr>
+              <w:t>系列、</w:t>
+            </w:r>
+            <w:proofErr w:type="spellStart"/>
+            <w:r>
+              <w:rPr>
+                <w:rFonts w:hint="eastAsia"/>
+              </w:rPr>
+              <w:t>ShuffleNet</w:t>
+            </w:r>
+            <w:proofErr w:type="spellEnd"/>
+            <w:r>
+              <w:rPr>
+                <w:rFonts w:hint="eastAsia"/>
+              </w:rPr>
+              <w:t>和</w:t>
+            </w:r>
+            <w:proofErr w:type="spellStart"/>
+            <w:r>
+              <w:rPr>
+                <w:rFonts w:hint="eastAsia"/>
+              </w:rPr>
+              <w:t>GhostNet</w:t>
+            </w:r>
+            <w:proofErr w:type="spellEnd"/>
+            <w:r>
+              <w:rPr>
+                <w:rFonts w:hint="eastAsia"/>
+              </w:rPr>
+              <w:t>为代表的轻量级网络架构为此提供了核心思路。例如，</w:t>
+            </w:r>
+            <w:proofErr w:type="spellStart"/>
+            <w:r>
+              <w:rPr>
+                <w:rFonts w:hint="eastAsia"/>
+              </w:rPr>
+              <w:t>MobileNet</w:t>
+            </w:r>
+            <w:proofErr w:type="spellEnd"/>
+            <w:r>
+              <w:rPr>
+                <w:rFonts w:hint="eastAsia"/>
+              </w:rPr>
+              <w:t>引入的深度可分离卷积、</w:t>
+            </w:r>
+            <w:proofErr w:type="spellStart"/>
+            <w:r>
+              <w:rPr>
+                <w:rFonts w:hint="eastAsia"/>
+              </w:rPr>
+              <w:t>ShuffleNet</w:t>
+            </w:r>
+            <w:proofErr w:type="spellEnd"/>
+            <w:r>
+              <w:rPr>
+                <w:rFonts w:hint="eastAsia"/>
+              </w:rPr>
+              <w:t>的通道混洗机制，以及</w:t>
+            </w:r>
+            <w:proofErr w:type="spellStart"/>
+            <w:r>
+              <w:rPr>
+                <w:rFonts w:hint="eastAsia"/>
+              </w:rPr>
+              <w:t>GhostNet</w:t>
+            </w:r>
+            <w:proofErr w:type="spellEnd"/>
+            <w:r>
+              <w:rPr>
+                <w:rFonts w:hint="eastAsia"/>
+              </w:rPr>
+              <w:t>通过廉价线性变换生成“幽灵”特征图的设计，都是在不牺牲过多性能的前提下，极大压缩模型体积的创新方法，为高性能模型在移动端和嵌入式设备上的应用铺平了道路。</w:t>
+            </w:r>
+          </w:p>
+          <w:p>
+            <w:pPr>
+              <w:pStyle w:val="af5"/>
+              <w:spacing w:beforeLines="50" w:before="156" w:afterLines="50" w:after="156"/>
+              <w:ind w:firstLine="480"/>
+            </w:pPr>
+            <w:r>
+              <w:rPr>
+                <w:rFonts w:hint="eastAsia"/>
+              </w:rPr>
+              <w:t>另一方面是通过引入注意力机制（Attention Mechanism）来强化模型的特征表达能力。该机制模仿人类视觉系统，使模型能够自适应地将计算资源聚焦于图像中的关键信息区域。从开创性地关注通道重要性的SE-Net，到融合了通道与空间维度的CBAM，再到追求更高效率、无需额外参数的SimAM，注意力机制已被广泛证明能够有效提升模型对微小目标、形态不规则以及被遮挡目标的识别能力，这与道路病害检测任务的特性高度契合。</w:t>
+            </w:r>
+          </w:p>
+          <w:p>
+            <w:pPr>
+              <w:pStyle w:val="af5"/>
+              <w:spacing w:beforeLines="50" w:before="156" w:afterLines="50" w:after="156"/>
+              <w:ind w:firstLine="480"/>
+            </w:pPr>
+            <w:r>
+              <w:rPr>
+                <w:rFonts w:hint="eastAsia"/>
+              </w:rPr>
+              <w:t>在此技术背景下，最新的YOLOv12模型应运而生，它通过对网络结构的深度优化，在多个公开基准数据集上展现了超越以往版本的卓越性能。尽管YOLOv12的性能已达到新的高度，但其计算开销对于资源极为受限的边缘设备而言仍存在优化的空间。更重要的是，针对道路病害这类具有多尺度、小目标频现、形态不规则等特性的特定检测任务，其固有的特征提取和融合能力仍有进一步提升的潜力。</w:t>
+            </w:r>
+          </w:p>
+          <w:p>
+            <w:pPr>
+              <w:pStyle w:val="af5"/>
+              <w:spacing w:beforeLines="50" w:before="156" w:afterLines="50" w:after="156"/>
+              <w:ind w:firstLine="480"/>
+              <w:rPr>
+                <w:rFonts w:ascii="黑体" w:eastAsia="黑体" w:hAnsi="黑体" w:hint="eastAsia"/>
+              </w:rPr>
+            </w:pPr>
+            <w:r>
+              <w:rPr>
+                <w:rFonts w:hint="eastAsia"/>
+              </w:rPr>
+              <w:t>因此，本研究选择YOLOv12作为基线模型（Baseline），旨在通过对其进行针对性的轻量化改造，并融合高效的注意力机制，探索一种在检测精度和推理速度上达到更优平衡的道路病害实时检测新范式，以期满足真实道路环境下高效率、高精度、低成本的部署需求。</w:t>
+            </w:r>
           </w:p>
         </w:tc>
       </w:tr>
@@ -1735,7 +2109,7 @@
                 <w:ilvl w:val="1"/>
                 <w:numId w:val="18"/>
               </w:numPr>
-              <w:ind w:right="-295" w:firstLineChars="0"/>
+              <w:ind w:left="0" w:firstLineChars="0" w:firstLine="0"/>
               <w:rPr>
                 <w:rFonts w:ascii="黑体" w:eastAsia="黑体" w:hAnsi="黑体" w:cs="Times New Roman"/>
                 <w:bCs/>
@@ -1774,7 +2148,25 @@
                 <w:kern w:val="0"/>
                 <w:sz w:val="24"/>
               </w:rPr>
-              <w:t>本研究的核心思路是以最新的YOLOv12模型为基础，针对道路病害检测任务在边缘设备上部署时对实时性和高精度的双重需求，从模型轻量化和特征增强两个维度进行深度改进。首先，对YOLOv12的网络结构进行详细解析，识别其关键计算瓶颈模块。然后，引入GhostNet的核心思想，设计一种新的轻量化模块来替代原有的高计算复杂度模块，以降低模型的参数量和计算量。同时，为了弥补轻量化可能带来的精度损失并增强模型对小目标的检测能力，选择并集成一种高效的注意力机制，优化网络对病害关键特征的捕捉能力。最终，将两种改进策略相结合，构建一个全新的、改进的YOLOv12检测模型。整个研究将依托公开的RDD2022道路病害数据集进行模型的训练、验证和测试，并通过全面的消融实验和对比实验，系统地评估所提方法的有效性和优越性。</w:t>
+              <w:t>本研究的核心思路是以最新的YOLOv12模型为基础，针对道路病害检测任务在边缘设备上部署时对实时性和高精度的双重需求，从模型轻量化和特征增强两个维度进行深度改进。首先，对YOLOv12的网络结构进行详细解析，识别其关键计算瓶颈模块。然后，引入</w:t>
+            </w:r>
+            <w:proofErr w:type="spellStart"/>
+            <w:r>
+              <w:rPr>
+                <w:rFonts w:ascii="宋体" w:hAnsi="宋体" w:cs="宋体"/>
+                <w:kern w:val="0"/>
+                <w:sz w:val="24"/>
+              </w:rPr>
+              <w:t>GhostNet</w:t>
+            </w:r>
+            <w:proofErr w:type="spellEnd"/>
+            <w:r>
+              <w:rPr>
+                <w:rFonts w:ascii="宋体" w:hAnsi="宋体" w:cs="宋体"/>
+                <w:kern w:val="0"/>
+                <w:sz w:val="24"/>
+              </w:rPr>
+              <w:t>的核心思想，设计一种新的轻量化模块来替代原有的高计算复杂度模块，以降低模型的参数量和计算量。同时，为了弥补轻量化可能带来的精度损失并增强模型对小目标的检测能力，选择并集成一种高效的注意力机制，优化网络对病害关键特征的捕捉能力。最终，将两种改进策略相结合，构建一个全新的、改进的YOLOv12检测模型。整个研究将依托公开的RDD2022道路病害数据集进行模型的训练、验证和测试，并通过全面的消融实验和对比实验，系统地评估所提方法的有效性和优越性。</w:t>
             </w:r>
           </w:p>
           <w:p>
@@ -1860,7 +2252,43 @@
                 <w:kern w:val="0"/>
                 <w:sz w:val="24"/>
               </w:rPr>
-              <w:t>本研究将采用国际权威的RDD2022（Road Damage Detection 2022）数据集作为实验数据。该数据集包含了来自全球多个国家的超过4万张道路图像，涵盖了多种类型和不同严重程度的病害，场景多样，极具挑战性。在模型训练阶段，将采用迁移学习策略，加载YOLOv12的预训练权重进行初始化，并结合Mosaic、MixUp等先进的数据增强技术来提升模型的泛化能力。</w:t>
+              <w:t>本研究将采用国际权威的RDD2022（Road Damage Detection 2022）数据集作为实验数据。该数据集包含了来自全球多个国家的超过4万张道路图像，涵盖了多种类型和不同严重程度的病害，场景多样，极具挑战性。在模型训练阶段，将采用迁移学习策略，加载YOLOv12的</w:t>
+            </w:r>
+            <w:proofErr w:type="gramStart"/>
+            <w:r>
+              <w:rPr>
+                <w:rFonts w:ascii="宋体" w:hAnsi="宋体" w:cs="宋体"/>
+                <w:kern w:val="0"/>
+                <w:sz w:val="24"/>
+              </w:rPr>
+              <w:t>预训练</w:t>
+            </w:r>
+            <w:proofErr w:type="gramEnd"/>
+            <w:r>
+              <w:rPr>
+                <w:rFonts w:ascii="宋体" w:hAnsi="宋体" w:cs="宋体"/>
+                <w:kern w:val="0"/>
+                <w:sz w:val="24"/>
+              </w:rPr>
+              <w:t>权重进行初始化，并结合Mosaic、</w:t>
+            </w:r>
+            <w:proofErr w:type="spellStart"/>
+            <w:r>
+              <w:rPr>
+                <w:rFonts w:ascii="宋体" w:hAnsi="宋体" w:cs="宋体"/>
+                <w:kern w:val="0"/>
+                <w:sz w:val="24"/>
+              </w:rPr>
+              <w:t>MixUp</w:t>
+            </w:r>
+            <w:proofErr w:type="spellEnd"/>
+            <w:r>
+              <w:rPr>
+                <w:rFonts w:ascii="宋体" w:hAnsi="宋体" w:cs="宋体"/>
+                <w:kern w:val="0"/>
+                <w:sz w:val="24"/>
+              </w:rPr>
+              <w:t>等先进的数据增强技术来提升模型的泛化能力。</w:t>
             </w:r>
           </w:p>
           <w:p>
@@ -1901,7 +2329,43 @@
                 <w:kern w:val="0"/>
                 <w:sz w:val="24"/>
               </w:rPr>
-              <w:t>深入分析YOLOv12的网络结构，定位其骨干网络（Backbone）或颈部网络（Neck）中计算量密集的核心模块（例如C3K2或其在YOLOv12中的等效高级模块）。本研究拟借鉴GhostNet的设计哲学，提出一种名为C3Ghost_K2的轻量化瓶颈模块。该模块将原始模块中的标准卷积操作分解为两步：首先，使用少量标准卷积核生成一部分“内在”特征图；然后，对这些内在特征图施加一系列计算成本极低的线性变换（如深度可分离卷积），以生成更多的“幽灵”特征图。最后，将内在特征图与幽灵特征图进行拼接（Concatenate），共同构成输出特征。通过这种方式，可以在显著减少模型参数量和FLOPs的同时，最大限度地保留原有的特征提取能力，从而在不牺牲过多精度的前提下，大幅提升模型的推理速度。</w:t>
+              <w:t>深入分析YOLOv12的网络结构，定位其骨干网络（Backbone）或颈部网络（Neck）中</w:t>
+            </w:r>
+            <w:proofErr w:type="gramStart"/>
+            <w:r>
+              <w:rPr>
+                <w:rFonts w:ascii="宋体" w:hAnsi="宋体" w:cs="宋体"/>
+                <w:kern w:val="0"/>
+                <w:sz w:val="24"/>
+              </w:rPr>
+              <w:t>计算量密集的核</w:t>
+            </w:r>
+            <w:proofErr w:type="gramEnd"/>
+            <w:r>
+              <w:rPr>
+                <w:rFonts w:ascii="宋体" w:hAnsi="宋体" w:cs="宋体"/>
+                <w:kern w:val="0"/>
+                <w:sz w:val="24"/>
+              </w:rPr>
+              <w:t>心模块（例如C3K2或其在YOLOv12中的等效高级模块）。本研究拟借鉴</w:t>
+            </w:r>
+            <w:proofErr w:type="spellStart"/>
+            <w:r>
+              <w:rPr>
+                <w:rFonts w:ascii="宋体" w:hAnsi="宋体" w:cs="宋体"/>
+                <w:kern w:val="0"/>
+                <w:sz w:val="24"/>
+              </w:rPr>
+              <w:t>GhostNet</w:t>
+            </w:r>
+            <w:proofErr w:type="spellEnd"/>
+            <w:r>
+              <w:rPr>
+                <w:rFonts w:ascii="宋体" w:hAnsi="宋体" w:cs="宋体"/>
+                <w:kern w:val="0"/>
+                <w:sz w:val="24"/>
+              </w:rPr>
+              <w:t>的设计哲学，提出一种名为C3Ghost_K2的轻量化瓶颈模块。该模块将原始模块中的标准卷积操作分解为两步：首先，使用少量标准卷积核生成一部分“内在”特征图；然后，对这些内在特征图施加一系列计算成本极低的线性变换（如深度可分离卷积），以生成更多的“幽灵”特征图。最后，将内在特征图与幽灵特征图进行拼接（Concatenate），共同构成输出特征。通过这种方式，可以在显著减少模型参数量和FLOPs的同时，最大限度地保留原有的特征提取能力，从而在不牺牲过多精度的前提下，大幅提升模型的推理速度。</w:t>
             </w:r>
           </w:p>
           <w:p>
@@ -1940,7 +2404,25 @@
                 <w:kern w:val="0"/>
                 <w:sz w:val="24"/>
               </w:rPr>
-              <w:t>为提升模型对道路裂缝、小型坑洞等细微且形态不规则目标的检测精度，本研究计划在改进后的网络中引入一种高效的注意力机制。初步选定SimAM（Simple, Parameter-Free Attention Module）作为研究对象。SimAM的突出优势在于其无需引入任何额外的可训练参数，即可为特征图的每个神经元推导出3D注意力权重，这与本研究的轻量化目标高度契合。计划将SimAM模块嵌入到骨干网络输出到颈部网络输入的关键节点。其理由是，骨干网络末端输出的特征图包含了丰富的高级语义信息，在此处引入注意力机制，可以帮助模型在进入多尺度特征融合阶段之前，就对最具信息量的特征通道和空间区域进行筛选和加权，从而有效抑制背景噪声干扰，强化对病害目标的表征。</w:t>
+              <w:t>为提升模型对道路裂缝、</w:t>
+            </w:r>
+            <w:proofErr w:type="gramStart"/>
+            <w:r>
+              <w:rPr>
+                <w:rFonts w:ascii="宋体" w:hAnsi="宋体" w:cs="宋体"/>
+                <w:kern w:val="0"/>
+                <w:sz w:val="24"/>
+              </w:rPr>
+              <w:t>小型坑</w:t>
+            </w:r>
+            <w:proofErr w:type="gramEnd"/>
+            <w:r>
+              <w:rPr>
+                <w:rFonts w:ascii="宋体" w:hAnsi="宋体" w:cs="宋体"/>
+                <w:kern w:val="0"/>
+                <w:sz w:val="24"/>
+              </w:rPr>
+              <w:t>洞等细微且形态不规则目标的检测精度，本研究计划在改进后的网络中引入一种高效的注意力机制。初步选定SimAM（Simple, Parameter-Free Attention Module）作为研究对象。SimAM的突出优势在于其无需引入任何额外的可训练参数，即可为特征图的每个神经元推导出3D注意力权重，这与本研究的轻量化目标高度契合。计划将SimAM模块嵌入到骨干网络输出到颈部网络输入的关键节点。其理由是，骨干网络末端输出的特征图包含了丰富的高级语义信息，在此处引入注意力机制，可以帮助模型在进入多尺度特征融合阶段之前，就对最具信息量的特征通道和空间区域进行筛选和加权，从而有效抑制背景噪声干扰，强化对病害目标的表征。</w:t>
             </w:r>
           </w:p>
           <w:p>
@@ -2118,7 +2600,21 @@
               <w:rPr>
                 <w:rFonts w:asciiTheme="minorEastAsia" w:eastAsiaTheme="minorEastAsia" w:hAnsiTheme="minorEastAsia"/>
               </w:rPr>
-              <w:t>为解决YOLOv12在边缘设备上部署时面临的计算资源瓶颈，提出一种轻量化改进策略。深入剖析YOLOv12网络结构，定位其计算密集型核心模块C3K2。借鉴GhostNet关于特征图冗余性的核心洞察，</w:t>
+              <w:t>为解决YOLOv12在边缘设备上部署时面临的计算资源瓶颈，提出一种轻量化改进策略。深入剖析YOLOv12网络结构，定位其计算密集型核心模块C3K2。借鉴</w:t>
+            </w:r>
+            <w:proofErr w:type="spellStart"/>
+            <w:r>
+              <w:rPr>
+                <w:rFonts w:asciiTheme="minorEastAsia" w:eastAsiaTheme="minorEastAsia" w:hAnsiTheme="minorEastAsia"/>
+              </w:rPr>
+              <w:t>GhostNet</w:t>
+            </w:r>
+            <w:proofErr w:type="spellEnd"/>
+            <w:r>
+              <w:rPr>
+                <w:rFonts w:asciiTheme="minorEastAsia" w:eastAsiaTheme="minorEastAsia" w:hAnsiTheme="minorEastAsia"/>
+              </w:rPr>
+              <w:t>关于特征图冗余性的核心洞察，</w:t>
             </w:r>
             <w:r>
               <w:rPr>
@@ -2215,7 +2711,21 @@
               <w:rPr>
                 <w:rFonts w:asciiTheme="minorEastAsia" w:eastAsiaTheme="minorEastAsia" w:hAnsiTheme="minorEastAsia"/>
               </w:rPr>
-              <w:t>将无参数注意力机制（SimAM）部署于骨干网络与颈部网络交汇的关键节点。 这一策略的核心在于，在网络将高级语义特征送入多尺度融合模块之前，先利用SimAM进行一次自适应的“筛选与重校准”。SimAM能够在不增加任何参数的前提下，为特征图中信息量最丰富的神经元（即病害区域）推导出更高的三维注意力权重，从而引导模型主动聚焦于关键目标，抑制背景噪声干扰。该方法以“零负担”的方式，显著提升了模型对疑难病害目标的检测精度。</w:t>
+              <w:t>将无参数注意力机制（SimAM）部署于骨干网络与颈部网络交汇的关键节点。 这一策略的核心在于，在网络将高级语义特征送入多尺度融合模块之前，先利用SimAM进行一次自适应的“筛选与重校准”。SimAM能够在不增加任何参数的前提下，为特征图中信息量最丰富的神经元（即病害区域）推导出更高的三维注意力权重，从而引导模型主动聚焦于关键目标，抑制背景噪声干扰。</w:t>
+            </w:r>
+            <w:proofErr w:type="gramStart"/>
+            <w:r>
+              <w:rPr>
+                <w:rFonts w:asciiTheme="minorEastAsia" w:eastAsiaTheme="minorEastAsia" w:hAnsiTheme="minorEastAsia"/>
+              </w:rPr>
+              <w:t>该方法以“零负担”的方式</w:t>
+            </w:r>
+            <w:proofErr w:type="gramEnd"/>
+            <w:r>
+              <w:rPr>
+                <w:rFonts w:asciiTheme="minorEastAsia" w:eastAsiaTheme="minorEastAsia" w:hAnsiTheme="minorEastAsia"/>
+              </w:rPr>
+              <w:t>，显著提升了模型对疑难病害目标的检测精度。</w:t>
             </w:r>
           </w:p>
           <w:p>
@@ -2476,7 +2986,21 @@
               <w:rPr>
                 <w:rFonts w:asciiTheme="minorEastAsia" w:eastAsiaTheme="minorEastAsia" w:hAnsiTheme="minorEastAsia"/>
               </w:rPr>
-              <w:t>实验平台： 实验将在高性能计算服务器上进行，硬件配置为NVIDIA RTX 40系列或同等级别GPU，软件环境为Ubuntu操作系统，采用PyTorch深度学习框架进行模型搭建与训练。</w:t>
+              <w:t>实验平台： 实验将在高性能计算服务器上进行，硬件配置为NVIDIA RTX 40系列或同等级别GPU，软件环境为Ubuntu操作系统，采用</w:t>
+            </w:r>
+            <w:proofErr w:type="spellStart"/>
+            <w:r>
+              <w:rPr>
+                <w:rFonts w:asciiTheme="minorEastAsia" w:eastAsiaTheme="minorEastAsia" w:hAnsiTheme="minorEastAsia"/>
+              </w:rPr>
+              <w:t>PyTorch</w:t>
+            </w:r>
+            <w:proofErr w:type="spellEnd"/>
+            <w:r>
+              <w:rPr>
+                <w:rFonts w:asciiTheme="minorEastAsia" w:eastAsiaTheme="minorEastAsia" w:hAnsiTheme="minorEastAsia"/>
+              </w:rPr>
+              <w:t>深度学习框架进行模型搭建与训练。</w:t>
             </w:r>
           </w:p>
           <w:p>
@@ -2632,11 +3156,19 @@
                 <w:rFonts w:asciiTheme="minorEastAsia" w:eastAsiaTheme="minorEastAsia" w:hAnsiTheme="minorEastAsia"/>
               </w:rPr>
             </w:pPr>
+            <w:proofErr w:type="gramStart"/>
             <w:r>
               <w:rPr>
                 <w:rFonts w:asciiTheme="minorEastAsia" w:eastAsiaTheme="minorEastAsia" w:hAnsiTheme="minorEastAsia"/>
               </w:rPr>
-              <w:t>2026年12月 - 2027年03月： 根据审稿意见修改论文，并开始撰写硕士学位论文的初稿。</w:t>
+              <w:t>2026年12月</w:t>
+            </w:r>
+            <w:proofErr w:type="gramEnd"/>
+            <w:r>
+              <w:rPr>
+                <w:rFonts w:asciiTheme="minorEastAsia" w:eastAsiaTheme="minorEastAsia" w:hAnsiTheme="minorEastAsia"/>
+              </w:rPr>
+              <w:t xml:space="preserve"> - 2027年03月： 根据审稿意见修改论文，并开始撰写硕士学位论文的初稿。</w:t>
             </w:r>
           </w:p>
           <w:p>
@@ -2779,7 +3311,23 @@
                 <w:rFonts w:asciiTheme="minorEastAsia" w:eastAsiaTheme="minorEastAsia" w:hAnsiTheme="minorEastAsia"/>
                 <w:bCs/>
               </w:rPr>
-              <w:t>本人已通过研究生阶段的课程学习，掌握了深度学习、计算机视觉和数字图像处理等领域的扎实理论基础。熟练掌握Python编程语言以及PyTorch等深度学习框架，具备独立进行模型设计、代码实现、实验调试与数据分析的能力。已对YOLO系列目标检测算法的发展脉络和核心原理进行了系统性的学习，并对模型轻量化及注意力机制等前沿技术进行了广泛的文献调研，为本课题的顺利开展奠定了坚实的基础。</w:t>
+              <w:t>本人已通过研究生阶段的课程学习，掌握了深度学习、计算机视觉和数字图像处理等领域的扎实理论基础。熟练掌握Python编程语言以及</w:t>
+            </w:r>
+            <w:proofErr w:type="spellStart"/>
+            <w:r>
+              <w:rPr>
+                <w:rFonts w:asciiTheme="minorEastAsia" w:eastAsiaTheme="minorEastAsia" w:hAnsiTheme="minorEastAsia"/>
+                <w:bCs/>
+              </w:rPr>
+              <w:t>PyTorch</w:t>
+            </w:r>
+            <w:proofErr w:type="spellEnd"/>
+            <w:r>
+              <w:rPr>
+                <w:rFonts w:asciiTheme="minorEastAsia" w:eastAsiaTheme="minorEastAsia" w:hAnsiTheme="minorEastAsia"/>
+                <w:bCs/>
+              </w:rPr>
+              <w:t>等深度学习框架，具备独立进行模型设计、代码实现、实验调试与数据分析的能力。已对YOLO系列目标检测算法的发展脉络和核心原理进行了系统性的学习，并对模型轻量化及注意力机制等前沿技术进行了广泛的文献调研，为本课题的顺利开展奠定了坚实的基础。</w:t>
             </w:r>
           </w:p>
           <w:p>
@@ -2905,7 +3453,23 @@
                 <w:rFonts w:asciiTheme="minorEastAsia" w:eastAsiaTheme="minorEastAsia" w:hAnsiTheme="minorEastAsia"/>
                 <w:bCs/>
               </w:rPr>
-              <w:t>针对问题一，本研究将通过引入GhostNet的设计思想，对YOLOv12的关键计算模块进行轻量化改造，旨在构建一个参数更少、计算更快的新模型架构，以满足实时检测的需求。</w:t>
+              <w:t>针对问题一，本研究将通过引入</w:t>
+            </w:r>
+            <w:proofErr w:type="spellStart"/>
+            <w:r>
+              <w:rPr>
+                <w:rFonts w:asciiTheme="minorEastAsia" w:eastAsiaTheme="minorEastAsia" w:hAnsiTheme="minorEastAsia"/>
+                <w:bCs/>
+              </w:rPr>
+              <w:t>GhostNet</w:t>
+            </w:r>
+            <w:proofErr w:type="spellEnd"/>
+            <w:r>
+              <w:rPr>
+                <w:rFonts w:asciiTheme="minorEastAsia" w:eastAsiaTheme="minorEastAsia" w:hAnsiTheme="minorEastAsia"/>
+                <w:bCs/>
+              </w:rPr>
+              <w:t>的设计思想，对YOLOv12的关键计算模块进行轻量化改造，旨在构建一个参数更少、计算更快的新模型架构，以满足实时检测的需求。</w:t>
             </w:r>
           </w:p>
           <w:p>
@@ -2967,7 +3531,25 @@
                 <w:sz w:val="28"/>
                 <w:szCs w:val="28"/>
               </w:rPr>
-              <w:t>(预算经费总额(元)、开支项目、主要用途、预算金费等)</w:t>
+              <w:t>(预算经费总额(元)、开支项目、主要用途、</w:t>
+            </w:r>
+            <w:proofErr w:type="gramStart"/>
+            <w:r>
+              <w:rPr>
+                <w:rFonts w:ascii="黑体" w:eastAsia="黑体" w:hAnsi="黑体" w:hint="eastAsia"/>
+                <w:sz w:val="28"/>
+                <w:szCs w:val="28"/>
+              </w:rPr>
+              <w:t>预算金</w:t>
+            </w:r>
+            <w:proofErr w:type="gramEnd"/>
+            <w:r>
+              <w:rPr>
+                <w:rFonts w:ascii="黑体" w:eastAsia="黑体" w:hAnsi="黑体" w:hint="eastAsia"/>
+                <w:sz w:val="28"/>
+                <w:szCs w:val="28"/>
+              </w:rPr>
+              <w:t>费等)</w:t>
             </w:r>
           </w:p>
           <w:tbl>
@@ -3081,7 +3663,15 @@
                 </w:tcPr>
                 <w:p>
                   <w:r>
-                    <w:t>资料复印、文献购买、参加国内学术会议等</w:t>
+                    <w:t>资料复印、文献购买、参加国</w:t>
+                  </w:r>
+                  <w:proofErr w:type="gramStart"/>
+                  <w:r>
+                    <w:t>内学术</w:t>
+                  </w:r>
+                  <w:proofErr w:type="gramEnd"/>
+                  <w:r>
+                    <w:t>会议等</w:t>
                   </w:r>
                 </w:p>
               </w:tc>
@@ -5331,6 +5921,7 @@
                 <w:sz w:val="24"/>
               </w:rPr>
             </w:pPr>
+            <w:proofErr w:type="gramStart"/>
             <w:r>
               <w:rPr>
                 <w:rFonts w:ascii="楷体" w:eastAsia="楷体" w:hAnsi="楷体" w:hint="eastAsia"/>
@@ -5352,39 +5943,48 @@
               </w:rPr>
               <w:t>]</w:t>
             </w:r>
+            <w:proofErr w:type="gramEnd"/>
             <w:r>
               <w:rPr>
                 <w:rFonts w:ascii="宋体" w:hAnsi="宋体" w:hint="eastAsia"/>
                 <w:szCs w:val="21"/>
               </w:rPr>
-              <w:t xml:space="preserve">吻合    </w:t>
-            </w:r>
-            <w:r>
-              <w:rPr>
-                <w:rFonts w:ascii="楷体" w:eastAsia="楷体" w:hAnsi="楷体" w:hint="eastAsia"/>
-                <w:sz w:val="24"/>
-              </w:rPr>
-              <w:t>[</w:t>
-            </w:r>
-            <w:r>
-              <w:rPr>
-                <w:rFonts w:ascii="楷体" w:eastAsia="楷体" w:hAnsi="楷体"/>
-                <w:sz w:val="24"/>
-              </w:rPr>
-              <w:t xml:space="preserve">  </w:t>
-            </w:r>
-            <w:r>
-              <w:rPr>
-                <w:rFonts w:ascii="楷体" w:eastAsia="楷体" w:hAnsi="楷体" w:hint="eastAsia"/>
-                <w:sz w:val="24"/>
-              </w:rPr>
-              <w:t>]</w:t>
-            </w:r>
+              <w:t xml:space="preserve">吻合 </w:t>
+            </w:r>
+            <w:proofErr w:type="gramStart"/>
             <w:r>
               <w:rPr>
                 <w:rFonts w:ascii="宋体" w:hAnsi="宋体" w:hint="eastAsia"/>
                 <w:szCs w:val="21"/>
               </w:rPr>
+              <w:t xml:space="preserve">   </w:t>
+            </w:r>
+            <w:r>
+              <w:rPr>
+                <w:rFonts w:ascii="楷体" w:eastAsia="楷体" w:hAnsi="楷体" w:hint="eastAsia"/>
+                <w:sz w:val="24"/>
+              </w:rPr>
+              <w:t>[</w:t>
+            </w:r>
+            <w:r>
+              <w:rPr>
+                <w:rFonts w:ascii="楷体" w:eastAsia="楷体" w:hAnsi="楷体"/>
+                <w:sz w:val="24"/>
+              </w:rPr>
+              <w:t xml:space="preserve">  </w:t>
+            </w:r>
+            <w:r>
+              <w:rPr>
+                <w:rFonts w:ascii="楷体" w:eastAsia="楷体" w:hAnsi="楷体" w:hint="eastAsia"/>
+                <w:sz w:val="24"/>
+              </w:rPr>
+              <w:t>]</w:t>
+            </w:r>
+            <w:r>
+              <w:rPr>
+                <w:rFonts w:ascii="宋体" w:hAnsi="宋体" w:hint="eastAsia"/>
+                <w:szCs w:val="21"/>
+              </w:rPr>
               <w:t>基本</w:t>
             </w:r>
             <w:r>
@@ -5394,6 +5994,7 @@
               </w:rPr>
               <w:t>吻合</w:t>
             </w:r>
+            <w:proofErr w:type="gramEnd"/>
             <w:r>
               <w:rPr>
                 <w:rFonts w:ascii="宋体" w:hAnsi="宋体" w:hint="eastAsia"/>
@@ -5401,6 +6002,7 @@
               </w:rPr>
               <w:t xml:space="preserve"> </w:t>
             </w:r>
+            <w:proofErr w:type="gramStart"/>
             <w:r>
               <w:rPr>
                 <w:rFonts w:ascii="宋体" w:hAnsi="宋体"/>
@@ -5443,6 +6045,7 @@
               </w:rPr>
               <w:t>不吻合</w:t>
             </w:r>
+            <w:proofErr w:type="gramEnd"/>
           </w:p>
         </w:tc>
       </w:tr>
@@ -6103,6 +6706,7 @@
                 <w:sz w:val="24"/>
               </w:rPr>
             </w:pPr>
+            <w:proofErr w:type="gramStart"/>
             <w:r>
               <w:rPr>
                 <w:rFonts w:ascii="楷体" w:eastAsia="楷体" w:hAnsi="楷体" w:hint="eastAsia"/>
@@ -6124,12 +6728,21 @@
               </w:rPr>
               <w:t>]</w:t>
             </w:r>
+            <w:proofErr w:type="gramEnd"/>
             <w:r>
               <w:rPr>
                 <w:rFonts w:ascii="宋体" w:hAnsi="宋体" w:hint="eastAsia"/>
                 <w:szCs w:val="21"/>
               </w:rPr>
-              <w:t xml:space="preserve"> 可行  </w:t>
+              <w:t xml:space="preserve"> 可行</w:t>
+            </w:r>
+            <w:proofErr w:type="gramStart"/>
+            <w:r>
+              <w:rPr>
+                <w:rFonts w:ascii="宋体" w:hAnsi="宋体" w:hint="eastAsia"/>
+                <w:szCs w:val="21"/>
+              </w:rPr>
+              <w:t xml:space="preserve">  </w:t>
             </w:r>
             <w:r>
               <w:rPr>
@@ -6159,41 +6772,51 @@
               </w:rPr>
               <w:t>]</w:t>
             </w:r>
+            <w:proofErr w:type="gramEnd"/>
             <w:r>
               <w:rPr>
                 <w:rFonts w:ascii="宋体" w:hAnsi="宋体" w:hint="eastAsia"/>
                 <w:szCs w:val="21"/>
               </w:rPr>
-              <w:t xml:space="preserve">  基本可行   </w:t>
-            </w:r>
-            <w:r>
-              <w:rPr>
-                <w:rFonts w:ascii="楷体" w:eastAsia="楷体" w:hAnsi="楷体" w:hint="eastAsia"/>
-                <w:sz w:val="24"/>
-              </w:rPr>
-              <w:t>[</w:t>
-            </w:r>
-            <w:r>
-              <w:rPr>
-                <w:rFonts w:ascii="楷体" w:eastAsia="楷体" w:hAnsi="楷体"/>
-                <w:sz w:val="24"/>
-              </w:rPr>
-              <w:t xml:space="preserve">  </w:t>
-            </w:r>
-            <w:r>
-              <w:rPr>
-                <w:rFonts w:ascii="楷体" w:eastAsia="楷体" w:hAnsi="楷体" w:hint="eastAsia"/>
-                <w:sz w:val="24"/>
-              </w:rPr>
-              <w:t>]</w:t>
-            </w:r>
+              <w:t xml:space="preserve">  基本可行</w:t>
+            </w:r>
+            <w:proofErr w:type="gramStart"/>
             <w:r>
               <w:rPr>
                 <w:rFonts w:ascii="宋体" w:hAnsi="宋体" w:hint="eastAsia"/>
                 <w:szCs w:val="21"/>
               </w:rPr>
+              <w:t xml:space="preserve">   </w:t>
+            </w:r>
+            <w:r>
+              <w:rPr>
+                <w:rFonts w:ascii="楷体" w:eastAsia="楷体" w:hAnsi="楷体" w:hint="eastAsia"/>
+                <w:sz w:val="24"/>
+              </w:rPr>
+              <w:t>[</w:t>
+            </w:r>
+            <w:r>
+              <w:rPr>
+                <w:rFonts w:ascii="楷体" w:eastAsia="楷体" w:hAnsi="楷体"/>
+                <w:sz w:val="24"/>
+              </w:rPr>
+              <w:t xml:space="preserve">  </w:t>
+            </w:r>
+            <w:r>
+              <w:rPr>
+                <w:rFonts w:ascii="楷体" w:eastAsia="楷体" w:hAnsi="楷体" w:hint="eastAsia"/>
+                <w:sz w:val="24"/>
+              </w:rPr>
+              <w:t>]</w:t>
+            </w:r>
+            <w:r>
+              <w:rPr>
+                <w:rFonts w:ascii="宋体" w:hAnsi="宋体" w:hint="eastAsia"/>
+                <w:szCs w:val="21"/>
+              </w:rPr>
               <w:t>不可行</w:t>
             </w:r>
+            <w:proofErr w:type="gramEnd"/>
           </w:p>
         </w:tc>
       </w:tr>
@@ -6561,6 +7184,7 @@
                 <w:szCs w:val="21"/>
               </w:rPr>
             </w:pPr>
+            <w:proofErr w:type="gramStart"/>
             <w:r>
               <w:rPr>
                 <w:rFonts w:ascii="楷体" w:eastAsia="楷体" w:hAnsi="楷体" w:hint="eastAsia"/>
@@ -6582,12 +7206,21 @@
               </w:rPr>
               <w:t>]</w:t>
             </w:r>
+            <w:proofErr w:type="gramEnd"/>
             <w:r>
               <w:rPr>
                 <w:rFonts w:ascii="宋体" w:hAnsi="宋体" w:hint="eastAsia"/>
                 <w:szCs w:val="21"/>
               </w:rPr>
-              <w:t xml:space="preserve">适合    </w:t>
+              <w:t xml:space="preserve">适合   </w:t>
+            </w:r>
+            <w:proofErr w:type="gramStart"/>
+            <w:r>
+              <w:rPr>
+                <w:rFonts w:ascii="宋体" w:hAnsi="宋体" w:hint="eastAsia"/>
+                <w:szCs w:val="21"/>
+              </w:rPr>
+              <w:t xml:space="preserve"> </w:t>
             </w:r>
             <w:r>
               <w:rPr>
@@ -6622,36 +7255,53 @@
                 <w:rFonts w:ascii="宋体" w:hAnsi="宋体" w:hint="eastAsia"/>
                 <w:szCs w:val="21"/>
               </w:rPr>
-              <w:t xml:space="preserve">基本适合      </w:t>
-            </w:r>
-            <w:r>
-              <w:rPr>
-                <w:rFonts w:ascii="楷体" w:eastAsia="楷体" w:hAnsi="楷体" w:hint="eastAsia"/>
-                <w:sz w:val="24"/>
-              </w:rPr>
-              <w:t>[</w:t>
-            </w:r>
-            <w:r>
-              <w:rPr>
-                <w:rFonts w:ascii="楷体" w:eastAsia="楷体" w:hAnsi="楷体"/>
-                <w:sz w:val="24"/>
-              </w:rPr>
-              <w:t xml:space="preserve">  </w:t>
-            </w:r>
-            <w:r>
-              <w:rPr>
-                <w:rFonts w:ascii="楷体" w:eastAsia="楷体" w:hAnsi="楷体" w:hint="eastAsia"/>
-                <w:sz w:val="24"/>
-              </w:rPr>
-              <w:t>]</w:t>
-            </w:r>
+              <w:t>基本适合</w:t>
+            </w:r>
+            <w:proofErr w:type="gramEnd"/>
             <w:r>
               <w:rPr>
                 <w:rFonts w:ascii="宋体" w:hAnsi="宋体" w:hint="eastAsia"/>
                 <w:szCs w:val="21"/>
               </w:rPr>
+              <w:t xml:space="preserve">   </w:t>
+            </w:r>
+            <w:proofErr w:type="gramStart"/>
+            <w:r>
+              <w:rPr>
+                <w:rFonts w:ascii="宋体" w:hAnsi="宋体" w:hint="eastAsia"/>
+                <w:szCs w:val="21"/>
+              </w:rPr>
+              <w:t xml:space="preserve">   </w:t>
+            </w:r>
+            <w:r>
+              <w:rPr>
+                <w:rFonts w:ascii="楷体" w:eastAsia="楷体" w:hAnsi="楷体" w:hint="eastAsia"/>
+                <w:sz w:val="24"/>
+              </w:rPr>
+              <w:t>[</w:t>
+            </w:r>
+            <w:r>
+              <w:rPr>
+                <w:rFonts w:ascii="楷体" w:eastAsia="楷体" w:hAnsi="楷体"/>
+                <w:sz w:val="24"/>
+              </w:rPr>
+              <w:t xml:space="preserve">  </w:t>
+            </w:r>
+            <w:r>
+              <w:rPr>
+                <w:rFonts w:ascii="楷体" w:eastAsia="楷体" w:hAnsi="楷体" w:hint="eastAsia"/>
+                <w:sz w:val="24"/>
+              </w:rPr>
+              <w:t>]</w:t>
+            </w:r>
+            <w:r>
+              <w:rPr>
+                <w:rFonts w:ascii="宋体" w:hAnsi="宋体" w:hint="eastAsia"/>
+                <w:szCs w:val="21"/>
+              </w:rPr>
               <w:t>不适合</w:t>
             </w:r>
+            <w:proofErr w:type="gramEnd"/>
           </w:p>
         </w:tc>
       </w:tr>
@@ -6763,7 +7413,15 @@
                 <w:rFonts w:ascii="宋体" w:hAnsi="宋体"/>
                 <w:szCs w:val="21"/>
               </w:rPr>
-              <w:t xml:space="preserve">   </w:t>
+              <w:t xml:space="preserve"> </w:t>
+            </w:r>
+            <w:proofErr w:type="gramStart"/>
+            <w:r>
+              <w:rPr>
+                <w:rFonts w:ascii="宋体" w:hAnsi="宋体"/>
+                <w:szCs w:val="21"/>
+              </w:rPr>
+              <w:t xml:space="preserve">  </w:t>
             </w:r>
             <w:r>
               <w:rPr>
@@ -6772,6 +7430,7 @@
               </w:rPr>
               <w:t>]</w:t>
             </w:r>
+            <w:proofErr w:type="gramEnd"/>
             <w:r>
               <w:rPr>
                 <w:rFonts w:ascii="宋体" w:hAnsi="宋体"/>
@@ -6809,14 +7468,30 @@
                 <w:rFonts w:ascii="宋体" w:hAnsi="宋体"/>
                 <w:szCs w:val="21"/>
               </w:rPr>
-              <w:t xml:space="preserve">   </w:t>
+              <w:t xml:space="preserve"> </w:t>
+            </w:r>
+            <w:proofErr w:type="gramStart"/>
+            <w:r>
+              <w:rPr>
+                <w:rFonts w:ascii="宋体" w:hAnsi="宋体"/>
+                <w:szCs w:val="21"/>
+              </w:rPr>
+              <w:t xml:space="preserve">  </w:t>
             </w:r>
             <w:r>
               <w:rPr>
                 <w:rFonts w:ascii="宋体" w:hAnsi="宋体" w:hint="eastAsia"/>
                 <w:szCs w:val="21"/>
               </w:rPr>
-              <w:t xml:space="preserve">] </w:t>
+              <w:t>]</w:t>
+            </w:r>
+            <w:proofErr w:type="gramEnd"/>
+            <w:r>
+              <w:rPr>
+                <w:rFonts w:ascii="宋体" w:hAnsi="宋体" w:hint="eastAsia"/>
+                <w:szCs w:val="21"/>
+              </w:rPr>
+              <w:t xml:space="preserve"> </w:t>
             </w:r>
             <w:r>
               <w:rPr>
@@ -6995,7 +7670,15 @@
                 <w:rFonts w:ascii="宋体" w:hAnsi="宋体"/>
                 <w:szCs w:val="21"/>
               </w:rPr>
-              <w:t xml:space="preserve">   </w:t>
+              <w:t xml:space="preserve"> </w:t>
+            </w:r>
+            <w:proofErr w:type="gramStart"/>
+            <w:r>
+              <w:rPr>
+                <w:rFonts w:ascii="宋体" w:hAnsi="宋体"/>
+                <w:szCs w:val="21"/>
+              </w:rPr>
+              <w:t xml:space="preserve">  </w:t>
             </w:r>
             <w:r>
               <w:rPr>
@@ -7004,6 +7687,7 @@
               </w:rPr>
               <w:t>]</w:t>
             </w:r>
+            <w:proofErr w:type="gramEnd"/>
             <w:r>
               <w:rPr>
                 <w:rFonts w:ascii="宋体" w:hAnsi="宋体"/>
@@ -7042,7 +7726,15 @@
                 <w:rFonts w:ascii="宋体" w:hAnsi="宋体"/>
                 <w:szCs w:val="21"/>
               </w:rPr>
-              <w:t xml:space="preserve">   </w:t>
+              <w:t xml:space="preserve"> </w:t>
+            </w:r>
+            <w:proofErr w:type="gramStart"/>
+            <w:r>
+              <w:rPr>
+                <w:rFonts w:ascii="宋体" w:hAnsi="宋体"/>
+                <w:szCs w:val="21"/>
+              </w:rPr>
+              <w:t xml:space="preserve">  </w:t>
             </w:r>
             <w:r>
               <w:rPr>
@@ -7051,6 +7743,7 @@
               </w:rPr>
               <w:t>]</w:t>
             </w:r>
+            <w:proofErr w:type="gramEnd"/>
             <w:r>
               <w:rPr>
                 <w:rFonts w:ascii="宋体" w:hAnsi="宋体"/>
@@ -7236,7 +7929,15 @@
                 <w:rFonts w:ascii="宋体" w:hAnsi="宋体"/>
                 <w:szCs w:val="21"/>
               </w:rPr>
-              <w:t xml:space="preserve">   </w:t>
+              <w:t xml:space="preserve"> </w:t>
+            </w:r>
+            <w:proofErr w:type="gramStart"/>
+            <w:r>
+              <w:rPr>
+                <w:rFonts w:ascii="宋体" w:hAnsi="宋体"/>
+                <w:szCs w:val="21"/>
+              </w:rPr>
+              <w:t xml:space="preserve">  </w:t>
             </w:r>
             <w:r>
               <w:rPr>
@@ -7245,6 +7946,7 @@
               </w:rPr>
               <w:t>]</w:t>
             </w:r>
+            <w:proofErr w:type="gramEnd"/>
             <w:r>
               <w:rPr>
                 <w:rFonts w:ascii="宋体" w:hAnsi="宋体"/>
@@ -7282,7 +7984,15 @@
                 <w:rFonts w:ascii="宋体" w:hAnsi="宋体"/>
                 <w:szCs w:val="21"/>
               </w:rPr>
-              <w:t xml:space="preserve">   </w:t>
+              <w:t xml:space="preserve"> </w:t>
+            </w:r>
+            <w:proofErr w:type="gramStart"/>
+            <w:r>
+              <w:rPr>
+                <w:rFonts w:ascii="宋体" w:hAnsi="宋体"/>
+                <w:szCs w:val="21"/>
+              </w:rPr>
+              <w:t xml:space="preserve">  </w:t>
             </w:r>
             <w:r>
               <w:rPr>
@@ -7291,6 +8001,7 @@
               </w:rPr>
               <w:t>]</w:t>
             </w:r>
+            <w:proofErr w:type="gramEnd"/>
             <w:r>
               <w:rPr>
                 <w:rFonts w:ascii="宋体" w:hAnsi="宋体"/>
@@ -8860,6 +9571,92 @@
     </w:lvl>
   </w:abstractNum>
   <w:abstractNum w:abstractNumId="14" w15:restartNumberingAfterBreak="0">
+    <w:nsid w:val="38303CFE"/>
+    <w:multiLevelType w:val="multilevel"/>
+    <w:tmpl w:val="0409001F"/>
+    <w:lvl w:ilvl="0">
+      <w:start w:val="1"/>
+      <w:numFmt w:val="decimal"/>
+      <w:lvlText w:val="%1."/>
+      <w:lvlJc w:val="left"/>
+      <w:pPr>
+        <w:ind w:left="425" w:hanging="425"/>
+      </w:pPr>
+    </w:lvl>
+    <w:lvl w:ilvl="1">
+      <w:start w:val="1"/>
+      <w:numFmt w:val="decimal"/>
+      <w:lvlText w:val="%1.%2."/>
+      <w:lvlJc w:val="left"/>
+      <w:pPr>
+        <w:ind w:left="567" w:hanging="567"/>
+      </w:pPr>
+    </w:lvl>
+    <w:lvl w:ilvl="2">
+      <w:start w:val="1"/>
+      <w:numFmt w:val="decimal"/>
+      <w:lvlText w:val="%1.%2.%3."/>
+      <w:lvlJc w:val="left"/>
+      <w:pPr>
+        <w:ind w:left="709" w:hanging="709"/>
+      </w:pPr>
+    </w:lvl>
+    <w:lvl w:ilvl="3">
+      <w:start w:val="1"/>
+      <w:numFmt w:val="decimal"/>
+      <w:lvlText w:val="%1.%2.%3.%4."/>
+      <w:lvlJc w:val="left"/>
+      <w:pPr>
+        <w:ind w:left="851" w:hanging="851"/>
+      </w:pPr>
+    </w:lvl>
+    <w:lvl w:ilvl="4">
+      <w:start w:val="1"/>
+      <w:numFmt w:val="decimal"/>
+      <w:lvlText w:val="%1.%2.%3.%4.%5."/>
+      <w:lvlJc w:val="left"/>
+      <w:pPr>
+        <w:ind w:left="992" w:hanging="992"/>
+      </w:pPr>
+    </w:lvl>
+    <w:lvl w:ilvl="5">
+      <w:start w:val="1"/>
+      <w:numFmt w:val="decimal"/>
+      <w:lvlText w:val="%1.%2.%3.%4.%5.%6."/>
+      <w:lvlJc w:val="left"/>
+      <w:pPr>
+        <w:ind w:left="1134" w:hanging="1134"/>
+      </w:pPr>
+    </w:lvl>
+    <w:lvl w:ilvl="6">
+      <w:start w:val="1"/>
+      <w:numFmt w:val="decimal"/>
+      <w:lvlText w:val="%1.%2.%3.%4.%5.%6.%7."/>
+      <w:lvlJc w:val="left"/>
+      <w:pPr>
+        <w:ind w:left="1276" w:hanging="1276"/>
+      </w:pPr>
+    </w:lvl>
+    <w:lvl w:ilvl="7">
+      <w:start w:val="1"/>
+      <w:numFmt w:val="decimal"/>
+      <w:lvlText w:val="%1.%2.%3.%4.%5.%6.%7.%8."/>
+      <w:lvlJc w:val="left"/>
+      <w:pPr>
+        <w:ind w:left="1418" w:hanging="1418"/>
+      </w:pPr>
+    </w:lvl>
+    <w:lvl w:ilvl="8">
+      <w:start w:val="1"/>
+      <w:numFmt w:val="decimal"/>
+      <w:lvlText w:val="%1.%2.%3.%4.%5.%6.%7.%8.%9."/>
+      <w:lvlJc w:val="left"/>
+      <w:pPr>
+        <w:ind w:left="1559" w:hanging="1559"/>
+      </w:pPr>
+    </w:lvl>
+  </w:abstractNum>
+  <w:abstractNum w:abstractNumId="15" w15:restartNumberingAfterBreak="0">
     <w:nsid w:val="3BB434FC"/>
     <w:multiLevelType w:val="multilevel"/>
     <w:tmpl w:val="C1CEAAD2"/>
@@ -9008,7 +9805,7 @@
       </w:rPr>
     </w:lvl>
   </w:abstractNum>
-  <w:abstractNum w:abstractNumId="15" w15:restartNumberingAfterBreak="0">
+  <w:abstractNum w:abstractNumId="16" w15:restartNumberingAfterBreak="0">
     <w:nsid w:val="3C333084"/>
     <w:multiLevelType w:val="multilevel"/>
     <w:tmpl w:val="3C333084"/>
@@ -9124,7 +9921,7 @@
       </w:pPr>
     </w:lvl>
   </w:abstractNum>
-  <w:abstractNum w:abstractNumId="16" w15:restartNumberingAfterBreak="0">
+  <w:abstractNum w:abstractNumId="17" w15:restartNumberingAfterBreak="0">
     <w:nsid w:val="3CE02E40"/>
     <w:multiLevelType w:val="hybridMultilevel"/>
     <w:tmpl w:val="8E38714A"/>
@@ -9237,7 +10034,7 @@
       </w:rPr>
     </w:lvl>
   </w:abstractNum>
-  <w:abstractNum w:abstractNumId="17" w15:restartNumberingAfterBreak="0">
+  <w:abstractNum w:abstractNumId="18" w15:restartNumberingAfterBreak="0">
     <w:nsid w:val="3FF85DA2"/>
     <w:multiLevelType w:val="hybridMultilevel"/>
     <w:tmpl w:val="1C261E6C"/>
@@ -9326,7 +10123,120 @@
       </w:pPr>
     </w:lvl>
   </w:abstractNum>
-  <w:abstractNum w:abstractNumId="18" w15:restartNumberingAfterBreak="0">
+  <w:abstractNum w:abstractNumId="19" w15:restartNumberingAfterBreak="0">
+    <w:nsid w:val="424172BC"/>
+    <w:multiLevelType w:val="multilevel"/>
+    <w:tmpl w:val="1A1032E0"/>
+    <w:lvl w:ilvl="0">
+      <w:start w:val="1"/>
+      <w:numFmt w:val="decimal"/>
+      <w:lvlText w:val="%1"/>
+      <w:lvlJc w:val="left"/>
+      <w:pPr>
+        <w:ind w:left="360" w:hanging="360"/>
+      </w:pPr>
+      <w:rPr>
+        <w:rFonts w:hint="default"/>
+      </w:rPr>
+    </w:lvl>
+    <w:lvl w:ilvl="1">
+      <w:start w:val="1"/>
+      <w:numFmt w:val="decimal"/>
+      <w:lvlText w:val="%1.%2"/>
+      <w:lvlJc w:val="left"/>
+      <w:pPr>
+        <w:ind w:left="360" w:hanging="360"/>
+      </w:pPr>
+      <w:rPr>
+        <w:rFonts w:hint="default"/>
+      </w:rPr>
+    </w:lvl>
+    <w:lvl w:ilvl="2">
+      <w:start w:val="1"/>
+      <w:numFmt w:val="decimal"/>
+      <w:lvlText w:val="%1.%2.%3"/>
+      <w:lvlJc w:val="left"/>
+      <w:pPr>
+        <w:ind w:left="720" w:hanging="720"/>
+      </w:pPr>
+      <w:rPr>
+        <w:rFonts w:hint="default"/>
+      </w:rPr>
+    </w:lvl>
+    <w:lvl w:ilvl="3">
+      <w:start w:val="1"/>
+      <w:numFmt w:val="decimal"/>
+      <w:lvlText w:val="%1.%2.%3.%4"/>
+      <w:lvlJc w:val="left"/>
+      <w:pPr>
+        <w:ind w:left="1080" w:hanging="1080"/>
+      </w:pPr>
+      <w:rPr>
+        <w:rFonts w:hint="default"/>
+      </w:rPr>
+    </w:lvl>
+    <w:lvl w:ilvl="4">
+      <w:start w:val="1"/>
+      <w:numFmt w:val="decimal"/>
+      <w:lvlText w:val="%1.%2.%3.%4.%5"/>
+      <w:lvlJc w:val="left"/>
+      <w:pPr>
+        <w:ind w:left="1080" w:hanging="1080"/>
+      </w:pPr>
+      <w:rPr>
+        <w:rFonts w:hint="default"/>
+      </w:rPr>
+    </w:lvl>
+    <w:lvl w:ilvl="5">
+      <w:start w:val="1"/>
+      <w:numFmt w:val="decimal"/>
+      <w:lvlText w:val="%1.%2.%3.%4.%5.%6"/>
+      <w:lvlJc w:val="left"/>
+      <w:pPr>
+        <w:ind w:left="1440" w:hanging="1440"/>
+      </w:pPr>
+      <w:rPr>
+        <w:rFonts w:hint="default"/>
+      </w:rPr>
+    </w:lvl>
+    <w:lvl w:ilvl="6">
+      <w:start w:val="1"/>
+      <w:numFmt w:val="decimal"/>
+      <w:lvlText w:val="%1.%2.%3.%4.%5.%6.%7"/>
+      <w:lvlJc w:val="left"/>
+      <w:pPr>
+        <w:ind w:left="1800" w:hanging="1800"/>
+      </w:pPr>
+      <w:rPr>
+        <w:rFonts w:hint="default"/>
+      </w:rPr>
+    </w:lvl>
+    <w:lvl w:ilvl="7">
+      <w:start w:val="1"/>
+      <w:numFmt w:val="decimal"/>
+      <w:lvlText w:val="%1.%2.%3.%4.%5.%6.%7.%8"/>
+      <w:lvlJc w:val="left"/>
+      <w:pPr>
+        <w:ind w:left="1800" w:hanging="1800"/>
+      </w:pPr>
+      <w:rPr>
+        <w:rFonts w:hint="default"/>
+      </w:rPr>
+    </w:lvl>
+    <w:lvl w:ilvl="8">
+      <w:start w:val="1"/>
+      <w:numFmt w:val="decimal"/>
+      <w:lvlText w:val="%1.%2.%3.%4.%5.%6.%7.%8.%9"/>
+      <w:lvlJc w:val="left"/>
+      <w:pPr>
+        <w:ind w:left="2160" w:hanging="2160"/>
+      </w:pPr>
+      <w:rPr>
+        <w:rFonts w:hint="default"/>
+      </w:rPr>
+    </w:lvl>
+  </w:abstractNum>
+  <w:abstractNum w:abstractNumId="20" w15:restartNumberingAfterBreak="0">
     <w:nsid w:val="44F959E4"/>
     <w:multiLevelType w:val="hybridMultilevel"/>
     <w:tmpl w:val="12FA6B32"/>
@@ -9415,7 +10325,7 @@
       </w:pPr>
     </w:lvl>
   </w:abstractNum>
-  <w:abstractNum w:abstractNumId="19" w15:restartNumberingAfterBreak="0">
+  <w:abstractNum w:abstractNumId="21" w15:restartNumberingAfterBreak="0">
     <w:nsid w:val="48E53881"/>
     <w:multiLevelType w:val="multilevel"/>
     <w:tmpl w:val="48E53881"/>
@@ -9504,7 +10414,7 @@
       </w:pPr>
     </w:lvl>
   </w:abstractNum>
-  <w:abstractNum w:abstractNumId="20" w15:restartNumberingAfterBreak="0">
+  <w:abstractNum w:abstractNumId="22" w15:restartNumberingAfterBreak="0">
     <w:nsid w:val="52F25D43"/>
     <w:multiLevelType w:val="hybridMultilevel"/>
     <w:tmpl w:val="38B85DE2"/>
@@ -9590,7 +10500,7 @@
       </w:pPr>
     </w:lvl>
   </w:abstractNum>
-  <w:abstractNum w:abstractNumId="21" w15:restartNumberingAfterBreak="0">
+  <w:abstractNum w:abstractNumId="23" w15:restartNumberingAfterBreak="0">
     <w:nsid w:val="534E2254"/>
     <w:multiLevelType w:val="multilevel"/>
     <w:tmpl w:val="531A725C"/>
@@ -9703,7 +10613,7 @@
       </w:rPr>
     </w:lvl>
   </w:abstractNum>
-  <w:abstractNum w:abstractNumId="22" w15:restartNumberingAfterBreak="0">
+  <w:abstractNum w:abstractNumId="24" w15:restartNumberingAfterBreak="0">
     <w:nsid w:val="543650FC"/>
     <w:multiLevelType w:val="multilevel"/>
     <w:tmpl w:val="1A6A9A5A"/>
@@ -9848,7 +10758,93 @@
       </w:rPr>
     </w:lvl>
   </w:abstractNum>
-  <w:abstractNum w:abstractNumId="23" w15:restartNumberingAfterBreak="0">
+  <w:abstractNum w:abstractNumId="25" w15:restartNumberingAfterBreak="0">
+    <w:nsid w:val="54FB7623"/>
+    <w:multiLevelType w:val="multilevel"/>
+    <w:tmpl w:val="1000001F"/>
+    <w:lvl w:ilvl="0">
+      <w:start w:val="1"/>
+      <w:numFmt w:val="decimal"/>
+      <w:lvlText w:val="%1."/>
+      <w:lvlJc w:val="left"/>
+      <w:pPr>
+        <w:ind w:left="360" w:hanging="360"/>
+      </w:pPr>
+    </w:lvl>
+    <w:lvl w:ilvl="1">
+      <w:start w:val="1"/>
+      <w:numFmt w:val="decimal"/>
+      <w:lvlText w:val="%1.%2."/>
+      <w:lvlJc w:val="left"/>
+      <w:pPr>
+        <w:ind w:left="792" w:hanging="432"/>
+      </w:pPr>
+    </w:lvl>
+    <w:lvl w:ilvl="2">
+      <w:start w:val="1"/>
+      <w:numFmt w:val="decimal"/>
+      <w:lvlText w:val="%1.%2.%3."/>
+      <w:lvlJc w:val="left"/>
+      <w:pPr>
+        <w:ind w:left="1224" w:hanging="504"/>
+      </w:pPr>
+    </w:lvl>
+    <w:lvl w:ilvl="3">
+      <w:start w:val="1"/>
+      <w:numFmt w:val="decimal"/>
+      <w:lvlText w:val="%1.%2.%3.%4."/>
+      <w:lvlJc w:val="left"/>
+      <w:pPr>
+        <w:ind w:left="1728" w:hanging="648"/>
+      </w:pPr>
+    </w:lvl>
+    <w:lvl w:ilvl="4">
+      <w:start w:val="1"/>
+      <w:numFmt w:val="decimal"/>
+      <w:lvlText w:val="%1.%2.%3.%4.%5."/>
+      <w:lvlJc w:val="left"/>
+      <w:pPr>
+        <w:ind w:left="2232" w:hanging="792"/>
+      </w:pPr>
+    </w:lvl>
+    <w:lvl w:ilvl="5">
+      <w:start w:val="1"/>
+      <w:numFmt w:val="decimal"/>
+      <w:lvlText w:val="%1.%2.%3.%4.%5.%6."/>
+      <w:lvlJc w:val="left"/>
+      <w:pPr>
+        <w:ind w:left="2736" w:hanging="936"/>
+      </w:pPr>
+    </w:lvl>
+    <w:lvl w:ilvl="6">
+      <w:start w:val="1"/>
+      <w:numFmt w:val="decimal"/>
+      <w:lvlText w:val="%1.%2.%3.%4.%5.%6.%7."/>
+      <w:lvlJc w:val="left"/>
+      <w:pPr>
+        <w:ind w:left="3240" w:hanging="1080"/>
+      </w:pPr>
+    </w:lvl>
+    <w:lvl w:ilvl="7">
+      <w:start w:val="1"/>
+      <w:numFmt w:val="decimal"/>
+      <w:lvlText w:val="%1.%2.%3.%4.%5.%6.%7.%8."/>
+      <w:lvlJc w:val="left"/>
+      <w:pPr>
+        <w:ind w:left="3744" w:hanging="1224"/>
+      </w:pPr>
+    </w:lvl>
+    <w:lvl w:ilvl="8">
+      <w:start w:val="1"/>
+      <w:numFmt w:val="decimal"/>
+      <w:lvlText w:val="%1.%2.%3.%4.%5.%6.%7.%8.%9."/>
+      <w:lvlJc w:val="left"/>
+      <w:pPr>
+        <w:ind w:left="4320" w:hanging="1440"/>
+      </w:pPr>
+    </w:lvl>
+  </w:abstractNum>
+  <w:abstractNum w:abstractNumId="26" w15:restartNumberingAfterBreak="0">
     <w:nsid w:val="589B72B5"/>
     <w:multiLevelType w:val="multilevel"/>
     <w:tmpl w:val="0409001F"/>
@@ -9934,7 +10930,7 @@
       </w:pPr>
     </w:lvl>
   </w:abstractNum>
-  <w:abstractNum w:abstractNumId="24" w15:restartNumberingAfterBreak="0">
+  <w:abstractNum w:abstractNumId="27" w15:restartNumberingAfterBreak="0">
     <w:nsid w:val="64027CFE"/>
     <w:multiLevelType w:val="hybridMultilevel"/>
     <w:tmpl w:val="BD366828"/>
@@ -10020,7 +11016,7 @@
       </w:pPr>
     </w:lvl>
   </w:abstractNum>
-  <w:abstractNum w:abstractNumId="25" w15:restartNumberingAfterBreak="0">
+  <w:abstractNum w:abstractNumId="28" w15:restartNumberingAfterBreak="0">
     <w:nsid w:val="643F7E5D"/>
     <w:multiLevelType w:val="multilevel"/>
     <w:tmpl w:val="FFDC2E58"/>
@@ -10133,14 +11129,14 @@
       </w:rPr>
     </w:lvl>
   </w:abstractNum>
-  <w:abstractNum w:abstractNumId="26" w15:restartNumberingAfterBreak="0">
+  <w:abstractNum w:abstractNumId="29" w15:restartNumberingAfterBreak="0">
     <w:nsid w:val="651D5C04"/>
     <w:multiLevelType w:val="multilevel"/>
-    <w:tmpl w:val="95FEC39E"/>
+    <w:tmpl w:val="1000001F"/>
     <w:lvl w:ilvl="0">
-      <w:start w:val="2"/>
-      <w:numFmt w:val="decimal"/>
-      <w:lvlText w:val="%1"/>
+      <w:start w:val="1"/>
+      <w:numFmt w:val="decimal"/>
+      <w:lvlText w:val="%1."/>
       <w:lvlJc w:val="left"/>
       <w:pPr>
         <w:ind w:left="360" w:hanging="360"/>
@@ -10152,10 +11148,10 @@
     <w:lvl w:ilvl="1">
       <w:start w:val="1"/>
       <w:numFmt w:val="decimal"/>
-      <w:lvlText w:val="%1.%2"/>
-      <w:lvlJc w:val="left"/>
-      <w:pPr>
-        <w:ind w:left="360" w:hanging="360"/>
+      <w:lvlText w:val="%1.%2."/>
+      <w:lvlJc w:val="left"/>
+      <w:pPr>
+        <w:ind w:left="792" w:hanging="432"/>
       </w:pPr>
       <w:rPr>
         <w:rFonts w:hint="default"/>
@@ -10164,10 +11160,10 @@
     <w:lvl w:ilvl="2">
       <w:start w:val="1"/>
       <w:numFmt w:val="decimal"/>
-      <w:lvlText w:val="%1.%2.%3"/>
-      <w:lvlJc w:val="left"/>
-      <w:pPr>
-        <w:ind w:left="720" w:hanging="720"/>
+      <w:lvlText w:val="%1.%2.%3."/>
+      <w:lvlJc w:val="left"/>
+      <w:pPr>
+        <w:ind w:left="1224" w:hanging="504"/>
       </w:pPr>
       <w:rPr>
         <w:rFonts w:hint="default"/>
@@ -10176,10 +11172,10 @@
     <w:lvl w:ilvl="3">
       <w:start w:val="1"/>
       <w:numFmt w:val="decimal"/>
-      <w:lvlText w:val="%1.%2.%3.%4"/>
-      <w:lvlJc w:val="left"/>
-      <w:pPr>
-        <w:ind w:left="1080" w:hanging="1080"/>
+      <w:lvlText w:val="%1.%2.%3.%4."/>
+      <w:lvlJc w:val="left"/>
+      <w:pPr>
+        <w:ind w:left="1728" w:hanging="648"/>
       </w:pPr>
       <w:rPr>
         <w:rFonts w:hint="default"/>
@@ -10188,10 +11184,10 @@
     <w:lvl w:ilvl="4">
       <w:start w:val="1"/>
       <w:numFmt w:val="decimal"/>
-      <w:lvlText w:val="%1.%2.%3.%4.%5"/>
-      <w:lvlJc w:val="left"/>
-      <w:pPr>
-        <w:ind w:left="1080" w:hanging="1080"/>
+      <w:lvlText w:val="%1.%2.%3.%4.%5."/>
+      <w:lvlJc w:val="left"/>
+      <w:pPr>
+        <w:ind w:left="2232" w:hanging="792"/>
       </w:pPr>
       <w:rPr>
         <w:rFonts w:hint="default"/>
@@ -10200,10 +11196,10 @@
     <w:lvl w:ilvl="5">
       <w:start w:val="1"/>
       <w:numFmt w:val="decimal"/>
-      <w:lvlText w:val="%1.%2.%3.%4.%5.%6"/>
-      <w:lvlJc w:val="left"/>
-      <w:pPr>
-        <w:ind w:left="1440" w:hanging="1440"/>
+      <w:lvlText w:val="%1.%2.%3.%4.%5.%6."/>
+      <w:lvlJc w:val="left"/>
+      <w:pPr>
+        <w:ind w:left="2736" w:hanging="936"/>
       </w:pPr>
       <w:rPr>
         <w:rFonts w:hint="default"/>
@@ -10212,10 +11208,10 @@
     <w:lvl w:ilvl="6">
       <w:start w:val="1"/>
       <w:numFmt w:val="decimal"/>
-      <w:lvlText w:val="%1.%2.%3.%4.%5.%6.%7"/>
-      <w:lvlJc w:val="left"/>
-      <w:pPr>
-        <w:ind w:left="1800" w:hanging="1800"/>
+      <w:lvlText w:val="%1.%2.%3.%4.%5.%6.%7."/>
+      <w:lvlJc w:val="left"/>
+      <w:pPr>
+        <w:ind w:left="3240" w:hanging="1080"/>
       </w:pPr>
       <w:rPr>
         <w:rFonts w:hint="default"/>
@@ -10224,10 +11220,10 @@
     <w:lvl w:ilvl="7">
       <w:start w:val="1"/>
       <w:numFmt w:val="decimal"/>
-      <w:lvlText w:val="%1.%2.%3.%4.%5.%6.%7.%8"/>
-      <w:lvlJc w:val="left"/>
-      <w:pPr>
-        <w:ind w:left="1800" w:hanging="1800"/>
+      <w:lvlText w:val="%1.%2.%3.%4.%5.%6.%7.%8."/>
+      <w:lvlJc w:val="left"/>
+      <w:pPr>
+        <w:ind w:left="3744" w:hanging="1224"/>
       </w:pPr>
       <w:rPr>
         <w:rFonts w:hint="default"/>
@@ -10236,17 +11232,103 @@
     <w:lvl w:ilvl="8">
       <w:start w:val="1"/>
       <w:numFmt w:val="decimal"/>
-      <w:lvlText w:val="%1.%2.%3.%4.%5.%6.%7.%8.%9"/>
-      <w:lvlJc w:val="left"/>
-      <w:pPr>
-        <w:ind w:left="2160" w:hanging="2160"/>
+      <w:lvlText w:val="%1.%2.%3.%4.%5.%6.%7.%8.%9."/>
+      <w:lvlJc w:val="left"/>
+      <w:pPr>
+        <w:ind w:left="4320" w:hanging="1440"/>
       </w:pPr>
       <w:rPr>
         <w:rFonts w:hint="default"/>
       </w:rPr>
     </w:lvl>
   </w:abstractNum>
-  <w:abstractNum w:abstractNumId="27" w15:restartNumberingAfterBreak="0">
+  <w:abstractNum w:abstractNumId="30" w15:restartNumberingAfterBreak="0">
+    <w:nsid w:val="6DED7AA7"/>
+    <w:multiLevelType w:val="multilevel"/>
+    <w:tmpl w:val="0409001F"/>
+    <w:lvl w:ilvl="0">
+      <w:start w:val="1"/>
+      <w:numFmt w:val="decimal"/>
+      <w:lvlText w:val="%1."/>
+      <w:lvlJc w:val="left"/>
+      <w:pPr>
+        <w:ind w:left="425" w:hanging="425"/>
+      </w:pPr>
+    </w:lvl>
+    <w:lvl w:ilvl="1">
+      <w:start w:val="1"/>
+      <w:numFmt w:val="decimal"/>
+      <w:lvlText w:val="%1.%2."/>
+      <w:lvlJc w:val="left"/>
+      <w:pPr>
+        <w:ind w:left="567" w:hanging="567"/>
+      </w:pPr>
+    </w:lvl>
+    <w:lvl w:ilvl="2">
+      <w:start w:val="1"/>
+      <w:numFmt w:val="decimal"/>
+      <w:lvlText w:val="%1.%2.%3."/>
+      <w:lvlJc w:val="left"/>
+      <w:pPr>
+        <w:ind w:left="709" w:hanging="709"/>
+      </w:pPr>
+    </w:lvl>
+    <w:lvl w:ilvl="3">
+      <w:start w:val="1"/>
+      <w:numFmt w:val="decimal"/>
+      <w:lvlText w:val="%1.%2.%3.%4."/>
+      <w:lvlJc w:val="left"/>
+      <w:pPr>
+        <w:ind w:left="851" w:hanging="851"/>
+      </w:pPr>
+    </w:lvl>
+    <w:lvl w:ilvl="4">
+      <w:start w:val="1"/>
+      <w:numFmt w:val="decimal"/>
+      <w:lvlText w:val="%1.%2.%3.%4.%5."/>
+      <w:lvlJc w:val="left"/>
+      <w:pPr>
+        <w:ind w:left="992" w:hanging="992"/>
+      </w:pPr>
+    </w:lvl>
+    <w:lvl w:ilvl="5">
+      <w:start w:val="1"/>
+      <w:numFmt w:val="decimal"/>
+      <w:lvlText w:val="%1.%2.%3.%4.%5.%6."/>
+      <w:lvlJc w:val="left"/>
+      <w:pPr>
+        <w:ind w:left="1134" w:hanging="1134"/>
+      </w:pPr>
+    </w:lvl>
+    <w:lvl w:ilvl="6">
+      <w:start w:val="1"/>
+      <w:numFmt w:val="decimal"/>
+      <w:lvlText w:val="%1.%2.%3.%4.%5.%6.%7."/>
+      <w:lvlJc w:val="left"/>
+      <w:pPr>
+        <w:ind w:left="1276" w:hanging="1276"/>
+      </w:pPr>
+    </w:lvl>
+    <w:lvl w:ilvl="7">
+      <w:start w:val="1"/>
+      <w:numFmt w:val="decimal"/>
+      <w:lvlText w:val="%1.%2.%3.%4.%5.%6.%7.%8."/>
+      <w:lvlJc w:val="left"/>
+      <w:pPr>
+        <w:ind w:left="1418" w:hanging="1418"/>
+      </w:pPr>
+    </w:lvl>
+    <w:lvl w:ilvl="8">
+      <w:start w:val="1"/>
+      <w:numFmt w:val="decimal"/>
+      <w:lvlText w:val="%1.%2.%3.%4.%5.%6.%7.%8.%9."/>
+      <w:lvlJc w:val="left"/>
+      <w:pPr>
+        <w:ind w:left="1559" w:hanging="1559"/>
+      </w:pPr>
+    </w:lvl>
+  </w:abstractNum>
+  <w:abstractNum w:abstractNumId="31" w15:restartNumberingAfterBreak="0">
     <w:nsid w:val="6F7D6274"/>
     <w:multiLevelType w:val="multilevel"/>
     <w:tmpl w:val="0409001F"/>
@@ -10332,7 +11414,7 @@
       </w:pPr>
     </w:lvl>
   </w:abstractNum>
-  <w:abstractNum w:abstractNumId="28" w15:restartNumberingAfterBreak="0">
+  <w:abstractNum w:abstractNumId="32" w15:restartNumberingAfterBreak="0">
     <w:nsid w:val="6F8ED505"/>
     <w:multiLevelType w:val="singleLevel"/>
     <w:tmpl w:val="6F8ED505"/>
@@ -10347,7 +11429,7 @@
       </w:rPr>
     </w:lvl>
   </w:abstractNum>
-  <w:abstractNum w:abstractNumId="29" w15:restartNumberingAfterBreak="0">
+  <w:abstractNum w:abstractNumId="33" w15:restartNumberingAfterBreak="0">
     <w:nsid w:val="71103BE6"/>
     <w:multiLevelType w:val="hybridMultilevel"/>
     <w:tmpl w:val="5694C9FE"/>
@@ -10465,10 +11547,10 @@
       </w:rPr>
     </w:lvl>
   </w:abstractNum>
-  <w:abstractNum w:abstractNumId="30" w15:restartNumberingAfterBreak="0">
+  <w:abstractNum w:abstractNumId="34" w15:restartNumberingAfterBreak="0">
     <w:nsid w:val="72E45938"/>
     <w:multiLevelType w:val="multilevel"/>
-    <w:tmpl w:val="1A1032E0"/>
+    <w:tmpl w:val="9AB47812"/>
     <w:lvl w:ilvl="0">
       <w:start w:val="1"/>
       <w:numFmt w:val="decimal"/>
@@ -10490,95 +11572,95 @@
         <w:ind w:left="360" w:hanging="360"/>
       </w:pPr>
       <w:rPr>
+        <w:rFonts w:ascii="黑体" w:eastAsia="黑体" w:hAnsi="黑体" w:hint="default"/>
+      </w:rPr>
+    </w:lvl>
+    <w:lvl w:ilvl="2">
+      <w:start w:val="1"/>
+      <w:numFmt w:val="decimal"/>
+      <w:lvlText w:val="%1.%2.%3"/>
+      <w:lvlJc w:val="left"/>
+      <w:pPr>
+        <w:ind w:left="720" w:hanging="720"/>
+      </w:pPr>
+      <w:rPr>
+        <w:rFonts w:ascii="黑体" w:eastAsia="黑体" w:hAnsi="黑体" w:hint="default"/>
+      </w:rPr>
+    </w:lvl>
+    <w:lvl w:ilvl="3">
+      <w:start w:val="1"/>
+      <w:numFmt w:val="decimal"/>
+      <w:lvlText w:val="%1.%2.%3.%4"/>
+      <w:lvlJc w:val="left"/>
+      <w:pPr>
+        <w:ind w:left="1080" w:hanging="1080"/>
+      </w:pPr>
+      <w:rPr>
         <w:rFonts w:hint="default"/>
       </w:rPr>
     </w:lvl>
-    <w:lvl w:ilvl="2">
-      <w:start w:val="1"/>
-      <w:numFmt w:val="decimal"/>
-      <w:lvlText w:val="%1.%2.%3"/>
-      <w:lvlJc w:val="left"/>
-      <w:pPr>
-        <w:ind w:left="720" w:hanging="720"/>
+    <w:lvl w:ilvl="4">
+      <w:start w:val="1"/>
+      <w:numFmt w:val="decimal"/>
+      <w:lvlText w:val="%1.%2.%3.%4.%5"/>
+      <w:lvlJc w:val="left"/>
+      <w:pPr>
+        <w:ind w:left="1080" w:hanging="1080"/>
       </w:pPr>
       <w:rPr>
         <w:rFonts w:hint="default"/>
       </w:rPr>
     </w:lvl>
-    <w:lvl w:ilvl="3">
-      <w:start w:val="1"/>
-      <w:numFmt w:val="decimal"/>
-      <w:lvlText w:val="%1.%2.%3.%4"/>
-      <w:lvlJc w:val="left"/>
-      <w:pPr>
-        <w:ind w:left="1080" w:hanging="1080"/>
+    <w:lvl w:ilvl="5">
+      <w:start w:val="1"/>
+      <w:numFmt w:val="decimal"/>
+      <w:lvlText w:val="%1.%2.%3.%4.%5.%6"/>
+      <w:lvlJc w:val="left"/>
+      <w:pPr>
+        <w:ind w:left="1440" w:hanging="1440"/>
       </w:pPr>
       <w:rPr>
         <w:rFonts w:hint="default"/>
       </w:rPr>
     </w:lvl>
-    <w:lvl w:ilvl="4">
-      <w:start w:val="1"/>
-      <w:numFmt w:val="decimal"/>
-      <w:lvlText w:val="%1.%2.%3.%4.%5"/>
-      <w:lvlJc w:val="left"/>
-      <w:pPr>
-        <w:ind w:left="1080" w:hanging="1080"/>
+    <w:lvl w:ilvl="6">
+      <w:start w:val="1"/>
+      <w:numFmt w:val="decimal"/>
+      <w:lvlText w:val="%1.%2.%3.%4.%5.%6.%7"/>
+      <w:lvlJc w:val="left"/>
+      <w:pPr>
+        <w:ind w:left="1800" w:hanging="1800"/>
       </w:pPr>
       <w:rPr>
         <w:rFonts w:hint="default"/>
       </w:rPr>
     </w:lvl>
-    <w:lvl w:ilvl="5">
-      <w:start w:val="1"/>
-      <w:numFmt w:val="decimal"/>
-      <w:lvlText w:val="%1.%2.%3.%4.%5.%6"/>
-      <w:lvlJc w:val="left"/>
-      <w:pPr>
-        <w:ind w:left="1440" w:hanging="1440"/>
+    <w:lvl w:ilvl="7">
+      <w:start w:val="1"/>
+      <w:numFmt w:val="decimal"/>
+      <w:lvlText w:val="%1.%2.%3.%4.%5.%6.%7.%8"/>
+      <w:lvlJc w:val="left"/>
+      <w:pPr>
+        <w:ind w:left="1800" w:hanging="1800"/>
       </w:pPr>
       <w:rPr>
         <w:rFonts w:hint="default"/>
       </w:rPr>
     </w:lvl>
-    <w:lvl w:ilvl="6">
-      <w:start w:val="1"/>
-      <w:numFmt w:val="decimal"/>
-      <w:lvlText w:val="%1.%2.%3.%4.%5.%6.%7"/>
-      <w:lvlJc w:val="left"/>
-      <w:pPr>
-        <w:ind w:left="1800" w:hanging="1800"/>
+    <w:lvl w:ilvl="8">
+      <w:start w:val="1"/>
+      <w:numFmt w:val="decimal"/>
+      <w:lvlText w:val="%1.%2.%3.%4.%5.%6.%7.%8.%9"/>
+      <w:lvlJc w:val="left"/>
+      <w:pPr>
+        <w:ind w:left="2160" w:hanging="2160"/>
       </w:pPr>
       <w:rPr>
         <w:rFonts w:hint="default"/>
       </w:rPr>
     </w:lvl>
-    <w:lvl w:ilvl="7">
-      <w:start w:val="1"/>
-      <w:numFmt w:val="decimal"/>
-      <w:lvlText w:val="%1.%2.%3.%4.%5.%6.%7.%8"/>
-      <w:lvlJc w:val="left"/>
-      <w:pPr>
-        <w:ind w:left="1800" w:hanging="1800"/>
-      </w:pPr>
-      <w:rPr>
-        <w:rFonts w:hint="default"/>
-      </w:rPr>
-    </w:lvl>
-    <w:lvl w:ilvl="8">
-      <w:start w:val="1"/>
-      <w:numFmt w:val="decimal"/>
-      <w:lvlText w:val="%1.%2.%3.%4.%5.%6.%7.%8.%9"/>
-      <w:lvlJc w:val="left"/>
-      <w:pPr>
-        <w:ind w:left="2160" w:hanging="2160"/>
-      </w:pPr>
-      <w:rPr>
-        <w:rFonts w:hint="default"/>
-      </w:rPr>
-    </w:lvl>
   </w:abstractNum>
-  <w:abstractNum w:abstractNumId="31" w15:restartNumberingAfterBreak="0">
+  <w:abstractNum w:abstractNumId="35" w15:restartNumberingAfterBreak="0">
     <w:nsid w:val="79BE3346"/>
     <w:multiLevelType w:val="hybridMultilevel"/>
     <w:tmpl w:val="35F6A9B6"/>
@@ -10693,7 +11775,7 @@
       </w:rPr>
     </w:lvl>
   </w:abstractNum>
-  <w:abstractNum w:abstractNumId="32" w15:restartNumberingAfterBreak="0">
+  <w:abstractNum w:abstractNumId="36" w15:restartNumberingAfterBreak="0">
     <w:nsid w:val="7F010E7F"/>
     <w:multiLevelType w:val="hybridMultilevel"/>
     <w:tmpl w:val="FFF02604"/>
@@ -10783,31 +11865,31 @@
     </w:lvl>
   </w:abstractNum>
   <w:num w:numId="1" w16cid:durableId="1779333812">
-    <w:abstractNumId w:val="28"/>
+    <w:abstractNumId w:val="32"/>
   </w:num>
   <w:num w:numId="2" w16cid:durableId="1067994644">
     <w:abstractNumId w:val="9"/>
   </w:num>
   <w:num w:numId="3" w16cid:durableId="571165151">
-    <w:abstractNumId w:val="19"/>
+    <w:abstractNumId w:val="21"/>
   </w:num>
   <w:num w:numId="4" w16cid:durableId="1710688027">
     <w:abstractNumId w:val="5"/>
   </w:num>
   <w:num w:numId="5" w16cid:durableId="241112609">
-    <w:abstractNumId w:val="15"/>
+    <w:abstractNumId w:val="16"/>
   </w:num>
   <w:num w:numId="6" w16cid:durableId="1503819390">
-    <w:abstractNumId w:val="14"/>
+    <w:abstractNumId w:val="15"/>
   </w:num>
   <w:num w:numId="7" w16cid:durableId="1549998759">
     <w:abstractNumId w:val="2"/>
   </w:num>
   <w:num w:numId="8" w16cid:durableId="2015842210">
-    <w:abstractNumId w:val="22"/>
+    <w:abstractNumId w:val="24"/>
   </w:num>
   <w:num w:numId="9" w16cid:durableId="1173960304">
-    <w:abstractNumId w:val="22"/>
+    <w:abstractNumId w:val="24"/>
     <w:lvlOverride w:ilvl="1">
       <w:startOverride w:val="1"/>
     </w:lvlOverride>
@@ -10819,10 +11901,10 @@
     <w:abstractNumId w:val="10"/>
   </w:num>
   <w:num w:numId="12" w16cid:durableId="102507323">
-    <w:abstractNumId w:val="23"/>
+    <w:abstractNumId w:val="26"/>
   </w:num>
   <w:num w:numId="13" w16cid:durableId="1352292447">
-    <w:abstractNumId w:val="27"/>
+    <w:abstractNumId w:val="31"/>
   </w:num>
   <w:num w:numId="14" w16cid:durableId="1851213286">
     <w:abstractNumId w:val="6"/>
@@ -10834,22 +11916,22 @@
     <w:abstractNumId w:val="12"/>
   </w:num>
   <w:num w:numId="17" w16cid:durableId="570123059">
-    <w:abstractNumId w:val="30"/>
+    <w:abstractNumId w:val="34"/>
   </w:num>
   <w:num w:numId="18" w16cid:durableId="485710187">
-    <w:abstractNumId w:val="26"/>
+    <w:abstractNumId w:val="29"/>
   </w:num>
   <w:num w:numId="19" w16cid:durableId="168106637">
+    <w:abstractNumId w:val="20"/>
+  </w:num>
+  <w:num w:numId="20" w16cid:durableId="904488338">
+    <w:abstractNumId w:val="28"/>
+  </w:num>
+  <w:num w:numId="21" w16cid:durableId="1927687122">
     <w:abstractNumId w:val="18"/>
   </w:num>
-  <w:num w:numId="20" w16cid:durableId="904488338">
-    <w:abstractNumId w:val="25"/>
-  </w:num>
-  <w:num w:numId="21" w16cid:durableId="1927687122">
-    <w:abstractNumId w:val="17"/>
-  </w:num>
   <w:num w:numId="22" w16cid:durableId="2057462586">
-    <w:abstractNumId w:val="24"/>
+    <w:abstractNumId w:val="27"/>
   </w:num>
   <w:num w:numId="23" w16cid:durableId="1919361615">
     <w:abstractNumId w:val="8"/>
@@ -10858,34 +11940,46 @@
     <w:abstractNumId w:val="0"/>
   </w:num>
   <w:num w:numId="25" w16cid:durableId="1478645930">
-    <w:abstractNumId w:val="21"/>
+    <w:abstractNumId w:val="23"/>
   </w:num>
   <w:num w:numId="26" w16cid:durableId="925460332">
-    <w:abstractNumId w:val="31"/>
+    <w:abstractNumId w:val="35"/>
   </w:num>
   <w:num w:numId="27" w16cid:durableId="1446728411">
-    <w:abstractNumId w:val="29"/>
+    <w:abstractNumId w:val="33"/>
   </w:num>
   <w:num w:numId="28" w16cid:durableId="1472332988">
-    <w:abstractNumId w:val="16"/>
+    <w:abstractNumId w:val="17"/>
   </w:num>
   <w:num w:numId="29" w16cid:durableId="1251541857">
     <w:abstractNumId w:val="13"/>
   </w:num>
   <w:num w:numId="30" w16cid:durableId="1442604914">
-    <w:abstractNumId w:val="20"/>
+    <w:abstractNumId w:val="22"/>
   </w:num>
   <w:num w:numId="31" w16cid:durableId="1001271844">
     <w:abstractNumId w:val="4"/>
   </w:num>
   <w:num w:numId="32" w16cid:durableId="362638135">
-    <w:abstractNumId w:val="32"/>
+    <w:abstractNumId w:val="36"/>
   </w:num>
   <w:num w:numId="33" w16cid:durableId="1062481554">
     <w:abstractNumId w:val="11"/>
   </w:num>
   <w:num w:numId="34" w16cid:durableId="560137402">
     <w:abstractNumId w:val="3"/>
+  </w:num>
+  <w:num w:numId="35" w16cid:durableId="1069495161">
+    <w:abstractNumId w:val="25"/>
+  </w:num>
+  <w:num w:numId="36" w16cid:durableId="765030535">
+    <w:abstractNumId w:val="14"/>
+  </w:num>
+  <w:num w:numId="37" w16cid:durableId="1619798848">
+    <w:abstractNumId w:val="30"/>
+  </w:num>
+  <w:num w:numId="38" w16cid:durableId="2035374117">
+    <w:abstractNumId w:val="19"/>
   </w:num>
 </w:numbering>
 </file>
@@ -11275,7 +12369,6 @@
   <w:style w:type="character" w:default="1" w:styleId="a0">
     <w:name w:val="Default Paragraph Font"/>
     <w:uiPriority w:val="1"/>
-    <w:semiHidden/>
     <w:unhideWhenUsed/>
   </w:style>
   <w:style w:type="table" w:default="1" w:styleId="a1">

</xml_diff>

<commit_message>
vault backup: 2025-09-26 20:13:45
</commit_message>
<xml_diff>
--- a/学校/刘非凡选题报告 .docx
+++ b/学校/刘非凡选题报告 .docx
@@ -116,7 +116,7 @@
           </mc:Choice>
           <mc:Fallback>
             <w:pict>
-              <v:group w14:anchorId="6827580F" id="Group 24" o:spid="_x0000_s1026" style="position:absolute;margin-left:63pt;margin-top:11.7pt;width:324pt;height:124.8pt;z-index:251659264" coordsize="6480,2964" o:gfxdata="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">
+              <v:group w14:anchorId="38442444" id="Group 24" o:spid="_x0000_s1026" style="position:absolute;margin-left:63pt;margin-top:11.7pt;width:324pt;height:124.8pt;z-index:251659264" coordsize="6480,2964" o:gfxdata="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